<commit_message>
migration path options v2 added after Q&A 3 was analyzed
</commit_message>
<xml_diff>
--- a/_bmad-output/planning-artifacts/migration-path-options-analysis.docx
+++ b/_bmad-output/planning-artifacts/migration-path-options-analysis.docx
@@ -2,13 +2,13 @@
 <file path=word/document.xml><?xml version="1.0" encoding="utf-8"?>
 <w:document xmlns:w="http://schemas.openxmlformats.org/wordprocessingml/2006/main" xmlns:m="http://schemas.openxmlformats.org/officeDocument/2006/math" xmlns:r="http://schemas.openxmlformats.org/officeDocument/2006/relationships" xmlns:o="urn:schemas-microsoft-com:office:office" xmlns:v="urn:schemas-microsoft-com:vml" xmlns:w10="urn:schemas-microsoft-com:office:word" xmlns:a="http://schemas.openxmlformats.org/drawingml/2006/main" xmlns:pic="http://schemas.openxmlformats.org/drawingml/2006/picture" xmlns:wp="http://schemas.openxmlformats.org/drawingml/2006/wordprocessingDrawing">
   <w:body>
-    <w:bookmarkStart w:id="27" w:name="migration-path-options-analysis"/>
+    <w:bookmarkStart w:id="29" w:name="migration-path-options-analysis-v2"/>
     <w:p>
       <w:pPr>
         <w:pStyle w:val="Heading1"/>
       </w:pPr>
       <w:r>
-        <w:t xml:space="preserve">Migration Path Options Analysis</w:t>
+        <w:t xml:space="preserve">Migration Path Options Analysis — v2</w:t>
       </w:r>
     </w:p>
     <w:bookmarkStart w:id="9" w:name="X01f4cb5d37e9695fb23e11c65053b7d1cda78ac"/>
@@ -38,7 +38,7 @@
         <w:t xml:space="preserve">AwsMigration — UTA Cloudinary → S3 Migration</w:t>
       </w:r>
       <w:r>
-        <w:br/>
+        <w:t xml:space="preserve"> </w:t>
       </w:r>
       <w:r>
         <w:rPr>
@@ -54,7 +54,7 @@
         <w:t xml:space="preserve">Edgar (Architect)</w:t>
       </w:r>
       <w:r>
-        <w:br/>
+        <w:t xml:space="preserve"> </w:t>
       </w:r>
       <w:r>
         <w:rPr>
@@ -67,10 +67,10 @@
         <w:t xml:space="preserve"> </w:t>
       </w:r>
       <w:r>
-        <w:t xml:space="preserve">March 15, 2026</w:t>
-      </w:r>
-      <w:r>
-        <w:br/>
+        <w:t xml:space="preserve">March 20, 2026</w:t>
+      </w:r>
+      <w:r>
+        <w:t xml:space="preserve"> </w:t>
       </w:r>
       <w:r>
         <w:rPr>
@@ -83,10 +83,26 @@
         <w:t xml:space="preserve"> </w:t>
       </w:r>
       <w:r>
-        <w:t xml:space="preserve">Draft — for Workshop with Client and Cloudinary Professional Services</w:t>
-      </w:r>
-      <w:r>
-        <w:br/>
+        <w:t xml:space="preserve">Updated — post Q&amp;A 3 (Danny / Cloudinary PS Pre-Engagement Call)</w:t>
+      </w:r>
+      <w:r>
+        <w:t xml:space="preserve"> </w:t>
+      </w:r>
+      <w:r>
+        <w:rPr>
+          <w:b/>
+          <w:bCs/>
+        </w:rPr>
+        <w:t xml:space="preserve">Supersedes:</w:t>
+      </w:r>
+      <w:r>
+        <w:t xml:space="preserve"> </w:t>
+      </w:r>
+      <w:r>
+        <w:t xml:space="preserve">migration-path-options-analysis.md (v1, March 15, 2026)</w:t>
+      </w:r>
+      <w:r>
+        <w:t xml:space="preserve"> </w:t>
       </w:r>
       <w:r>
         <w:rPr>
@@ -124,15 +140,7 @@
         <w:pStyle w:val="FirstParagraph"/>
       </w:pPr>
       <w:r>
-        <w:t xml:space="preserve">This document presents a structured comparison of three candidate migration paths for moving ~3 TB of binary assets (images, videos, audio, PDFs) from Cloudinary-managed storage to UTA-owned S3, while retaining Cloudinary as the CDN and metadata management layer (BYOB — Bring Your Own Bucket).</w:t>
-      </w:r>
-    </w:p>
-    <w:p>
-      <w:pPr>
-        <w:pStyle w:val="BodyText"/>
-      </w:pPr>
-      <w:r>
-        <w:t xml:space="preserve">The analysis is intended as a decision-support artifact for the workshop between UTA, the delivery team, and Cloudinary Professional Services. Several options carry open unknowns that must be clarified by Cloudinary PS during that session.</w:t>
+        <w:t xml:space="preserve">This document presents a structured comparison of the two remaining viable migration paths for moving ~3 TB of binary assets (images, videos, audio, PDFs) from Cloudinary-managed storage to UTA-owned S3, while retaining Cloudinary as the CDN and metadata management layer (BYOB — Bring Your Own Bucket).</w:t>
       </w:r>
     </w:p>
     <w:p>
@@ -144,47 +152,7 @@
           <w:b/>
           <w:bCs/>
         </w:rPr>
-        <w:t xml:space="preserve">Prerequisite (applies to all options):</w:t>
-      </w:r>
-      <w:r>
-        <w:t xml:space="preserve"> </w:t>
-      </w:r>
-      <w:r>
-        <w:t xml:space="preserve">A new Cloudinary environment must be created before any migration work begins. This is non-negotiable for protecting the live production environment. The new environment will also be the target for BYOB configuration.</w:t>
-      </w:r>
-    </w:p>
-    <w:p>
-      <w:r>
-        <w:pict>
-          <v:rect style="width:0;height:1.5pt" o:hralign="center" o:hrstd="t" o:hr="t"/>
-        </w:pict>
-      </w:r>
-    </w:p>
-    <w:bookmarkEnd w:id="10"/>
-    <w:bookmarkStart w:id="16" w:name="the-three-candidate-options"/>
-    <w:p>
-      <w:pPr>
-        <w:pStyle w:val="Heading2"/>
-      </w:pPr>
-      <w:r>
-        <w:t xml:space="preserve">The Three Candidate Options</w:t>
-      </w:r>
-    </w:p>
-    <w:bookmarkStart w:id="13" w:name="option-a-cloudinary-cli-sync-clone"/>
-    <w:p>
-      <w:pPr>
-        <w:pStyle w:val="Heading3"/>
-      </w:pPr>
-      <w:r>
-        <w:t xml:space="preserve">Option A — Cloudinary CLI Sync / Clone</w:t>
-      </w:r>
-    </w:p>
-    <w:p>
-      <w:pPr>
-        <w:pStyle w:val="FirstParagraph"/>
-      </w:pPr>
-      <w:r>
-        <w:t xml:space="preserve">Use the Cloudinary CLI’s</w:t>
+        <w:t xml:space="preserve">Q&amp;A 3 resolved the single most important open question from v1:</w:t>
       </w:r>
       <w:r>
         <w:t xml:space="preserve"> </w:t>
@@ -193,84 +161,31 @@
         <w:rPr>
           <w:rStyle w:val="VerbatimChar"/>
         </w:rPr>
-        <w:t xml:space="preserve">sync</w:t>
-      </w:r>
-      <w:r>
-        <w:t xml:space="preserve"> </w:t>
-      </w:r>
-      <w:r>
-        <w:t xml:space="preserve">or</w:t>
-      </w:r>
-      <w:r>
-        <w:t xml:space="preserve"> </w:t>
-      </w:r>
-      <w:r>
-        <w:rPr>
-          <w:rStyle w:val="VerbatimChar"/>
-        </w:rPr>
-        <w:t xml:space="preserve">clone</w:t>
-      </w:r>
-      <w:r>
-        <w:t xml:space="preserve"> </w:t>
-      </w:r>
-      <w:r>
-        <w:t xml:space="preserve">command to replicate assets and metadata from the existing Cloudinary environment into the new environment backed by UTA’s S3 (BYOB).</w:t>
-      </w:r>
-    </w:p>
-    <w:p>
-      <w:pPr>
-        <w:pStyle w:val="Compact"/>
-        <w:numPr>
-          <w:ilvl w:val="0"/>
-          <w:numId w:val="1001"/>
-        </w:numPr>
-      </w:pPr>
-      <w:r>
-        <w:rPr>
-          <w:rStyle w:val="VerbatimChar"/>
-          <w:b/>
-          <w:bCs/>
-        </w:rPr>
-        <w:t xml:space="preserve">cld sync</w:t>
-      </w:r>
-      <w:r>
-        <w:t xml:space="preserve">: Documented for local-folder ↔ cloud synchronization. Whether it supports cloud-to-cloud (environment-to-environment) is</w:t>
-      </w:r>
-      <w:r>
-        <w:t xml:space="preserve"> </w:t>
-      </w:r>
+        <w:t xml:space="preserve">cld clone</w:t>
+      </w:r>
+      <w:r>
+        <w:t xml:space="preserve"> </w:t>
+      </w:r>
+      <w:r>
+        <w:t xml:space="preserve">is now confirmed to copy binary assets and metadata server-side, which collapses the original three-option space into a direct comparison between two credible options. Option C (S3 cross-account copy) remains deferred to the PS scoping session; it is not a planning basis.</w:t>
+      </w:r>
+    </w:p>
+    <w:p>
+      <w:pPr>
+        <w:pStyle w:val="BodyText"/>
+      </w:pPr>
       <w:r>
         <w:rPr>
           <w:b/>
           <w:bCs/>
         </w:rPr>
-        <w:t xml:space="preserve">not confirmed</w:t>
-      </w:r>
-      <w:r>
-        <w:t xml:space="preserve"> </w:t>
-      </w:r>
-      <w:r>
-        <w:t xml:space="preserve">by public documentation.</w:t>
-      </w:r>
-    </w:p>
-    <w:p>
-      <w:pPr>
-        <w:pStyle w:val="Compact"/>
-        <w:numPr>
-          <w:ilvl w:val="0"/>
-          <w:numId w:val="1001"/>
-        </w:numPr>
-      </w:pPr>
-      <w:r>
-        <w:rPr>
-          <w:rStyle w:val="VerbatimChar"/>
-          <w:b/>
-          <w:bCs/>
-        </w:rPr>
-        <w:t xml:space="preserve">cld clone</w:t>
-      </w:r>
-      <w:r>
-        <w:t xml:space="preserve">: Appears to perform environment-level duplication. Whether it carries binary assets, metadata, structured fields, and tags into a BYOB-backed target is</w:t>
+        <w:t xml:space="preserve">Prerequisite (applies to both options):</w:t>
+      </w:r>
+      <w:r>
+        <w:t xml:space="preserve"> </w:t>
+      </w:r>
+      <w:r>
+        <w:t xml:space="preserve">Cloudinary PS must configure the new BYOB-backed environment — and set the S3 backend pointer —</w:t>
       </w:r>
       <w:r>
         <w:t xml:space="preserve"> </w:t>
@@ -280,63 +195,14 @@
           <w:b/>
           <w:bCs/>
         </w:rPr>
-        <w:t xml:space="preserve">not confirmed</w:t>
-      </w:r>
-      <w:r>
-        <w:t xml:space="preserve">.</w:t>
-      </w:r>
-    </w:p>
-    <w:p>
-      <w:pPr>
-        <w:pStyle w:val="Compact"/>
-        <w:numPr>
-          <w:ilvl w:val="0"/>
-          <w:numId w:val="1001"/>
-        </w:numPr>
-      </w:pPr>
-      <w:r>
-        <w:t xml:space="preserve">If it works as hoped, this collapses the migration into a single command execution managed by Cloudinary’s platform.</w:t>
-      </w:r>
-    </w:p>
-    <w:p>
-      <w:pPr>
-        <w:pStyle w:val="FirstParagraph"/>
-      </w:pPr>
-      <w:r>
-        <w:rPr>
-          <w:b/>
-          <w:bCs/>
-        </w:rPr>
-        <w:t xml:space="preserve">Reference:</w:t>
-      </w:r>
-      <w:r>
-        <w:t xml:space="preserve"> </w:t>
-      </w:r>
-      <w:hyperlink r:id="rId11">
-        <w:r>
-          <w:rPr>
-            <w:rStyle w:val="Hyperlink"/>
-          </w:rPr>
-          <w:t xml:space="preserve">Cloudinary CLI sync docs</w:t>
-        </w:r>
-      </w:hyperlink>
-      <w:r>
-        <w:t xml:space="preserve"> </w:t>
-      </w:r>
-      <w:r>
-        <w:t xml:space="preserve">|</w:t>
-      </w:r>
-      <w:r>
-        <w:t xml:space="preserve"> </w:t>
-      </w:r>
-      <w:hyperlink r:id="rId12">
-        <w:r>
-          <w:rPr>
-            <w:rStyle w:val="Hyperlink"/>
-          </w:rPr>
-          <w:t xml:space="preserve">Cloudinary CLI clone docs</w:t>
-        </w:r>
-      </w:hyperlink>
+        <w:t xml:space="preserve">before</w:t>
+      </w:r>
+      <w:r>
+        <w:t xml:space="preserve"> </w:t>
+      </w:r>
+      <w:r>
+        <w:t xml:space="preserve">any migration work begins. This is a hard dependency confirmed in Q&amp;A 3.</w:t>
+      </w:r>
     </w:p>
     <w:p>
       <w:r>
@@ -345,228 +211,14 @@
         </w:pict>
       </w:r>
     </w:p>
-    <w:bookmarkEnd w:id="13"/>
-    <w:bookmarkStart w:id="14" w:name="X75ee0b4ac65a297c8aa23b116b527725750a41e"/>
-    <w:p>
-      <w:pPr>
-        <w:pStyle w:val="Heading3"/>
-      </w:pPr>
-      <w:r>
-        <w:t xml:space="preserve">Option B — Worker Fleet (Python SDK + SQS + DynamoDB)</w:t>
-      </w:r>
-    </w:p>
-    <w:p>
-      <w:pPr>
-        <w:pStyle w:val="FirstParagraph"/>
-      </w:pPr>
-      <w:r>
-        <w:t xml:space="preserve">A purpose-built migration engine: a Python controller enqueues all asset identifiers into SQS; a pool of stateless workers reads the queue, downloads each asset from Cloudinary, uploads it to UTA S3, and updates Cloudinary metadata in the new environment. This is the architecture described in the PRD.</w:t>
-      </w:r>
-    </w:p>
-    <w:p>
-      <w:pPr>
-        <w:pStyle w:val="Compact"/>
-        <w:numPr>
-          <w:ilvl w:val="0"/>
-          <w:numId w:val="1002"/>
-        </w:numPr>
-      </w:pPr>
-      <w:r>
-        <w:t xml:space="preserve">Full programmatic control over every asset.</w:t>
-      </w:r>
-    </w:p>
-    <w:p>
-      <w:pPr>
-        <w:pStyle w:val="Compact"/>
-        <w:numPr>
-          <w:ilvl w:val="0"/>
-          <w:numId w:val="1002"/>
-        </w:numPr>
-      </w:pPr>
-      <w:r>
-        <w:t xml:space="preserve">Rate limiting, retry, and dead-letter handling are first-class concerns in the design.</w:t>
-      </w:r>
-    </w:p>
-    <w:p>
-      <w:pPr>
-        <w:pStyle w:val="Compact"/>
-        <w:numPr>
-          <w:ilvl w:val="0"/>
-          <w:numId w:val="1002"/>
-        </w:numPr>
-      </w:pPr>
-      <w:r>
-        <w:t xml:space="preserve">Per-asset state is tracked in DynamoDB; observability via CloudWatch and Datadog.</w:t>
-      </w:r>
-    </w:p>
-    <w:p>
-      <w:pPr>
-        <w:pStyle w:val="Compact"/>
-        <w:numPr>
-          <w:ilvl w:val="0"/>
-          <w:numId w:val="1002"/>
-        </w:numPr>
-      </w:pPr>
-      <w:r>
-        <w:t xml:space="preserve">Pilot batch (100 assets) is a native concept — easy to validate before scaling.</w:t>
-      </w:r>
-    </w:p>
-    <w:p>
-      <w:pPr>
-        <w:pStyle w:val="FirstParagraph"/>
-      </w:pPr>
-      <w:r>
-        <w:rPr>
-          <w:b/>
-          <w:bCs/>
-        </w:rPr>
-        <w:t xml:space="preserve">Reference:</w:t>
-      </w:r>
-      <w:r>
-        <w:t xml:space="preserve"> </w:t>
-      </w:r>
-      <w:r>
-        <w:t xml:space="preserve">PRD Section</w:t>
-      </w:r>
-      <w:r>
-        <w:t xml:space="preserve"> </w:t>
-      </w:r>
-      <w:r>
-        <w:t xml:space="preserve">“Worker Flow”</w:t>
-      </w:r>
-      <w:r>
-        <w:t xml:space="preserve"> </w:t>
-      </w:r>
-      <w:r>
-        <w:t xml:space="preserve">and</w:t>
-      </w:r>
-      <w:r>
-        <w:t xml:space="preserve"> </w:t>
-      </w:r>
-      <w:r>
-        <w:t xml:space="preserve">“Components.”</w:t>
-      </w:r>
-    </w:p>
-    <w:p>
-      <w:r>
-        <w:pict>
-          <v:rect style="width:0;height:1.5pt" o:hralign="center" o:hrstd="t" o:hr="t"/>
-        </w:pict>
-      </w:r>
-    </w:p>
-    <w:bookmarkEnd w:id="14"/>
-    <w:bookmarkStart w:id="15" w:name="X4ad4c9858bcc47a55a841e0dfe2c0d8f48c7ea2"/>
-    <w:p>
-      <w:pPr>
-        <w:pStyle w:val="Heading3"/>
-      </w:pPr>
-      <w:r>
-        <w:t xml:space="preserve">Option C — S3 Tenant Ownership Transfer (or Cross-Account Copy)</w:t>
-      </w:r>
-    </w:p>
-    <w:p>
-      <w:pPr>
-        <w:pStyle w:val="FirstParagraph"/>
-      </w:pPr>
-      <w:r>
-        <w:t xml:space="preserve">Copy raw object data at the S3 layer — either from Cloudinary’s internal S3 bucket directly to UTA’s S3 bucket — and then reconcile Cloudinary metadata separately.</w:t>
-      </w:r>
-    </w:p>
-    <w:p>
-      <w:pPr>
-        <w:pStyle w:val="Compact"/>
-        <w:numPr>
-          <w:ilvl w:val="0"/>
-          <w:numId w:val="1003"/>
-        </w:numPr>
-      </w:pPr>
-      <w:r>
-        <w:t xml:space="preserve">Sub-variant C1: Ask AWS to perform a storage-layer</w:t>
-      </w:r>
-      <w:r>
-        <w:t xml:space="preserve"> </w:t>
-      </w:r>
-      <w:r>
-        <w:t xml:space="preserve">“ownership transfer”</w:t>
-      </w:r>
-      <w:r>
-        <w:t xml:space="preserve"> </w:t>
-      </w:r>
-      <w:r>
-        <w:t xml:space="preserve">(bucket ownership change across tenants). This is</w:t>
-      </w:r>
-      <w:r>
-        <w:t xml:space="preserve"> </w:t>
-      </w:r>
-      <w:r>
-        <w:rPr>
-          <w:b/>
-          <w:bCs/>
-        </w:rPr>
-        <w:t xml:space="preserve">not a standard AWS feature</w:t>
-      </w:r>
-      <w:r>
-        <w:t xml:space="preserve"> </w:t>
-      </w:r>
-      <w:r>
-        <w:t xml:space="preserve">and is considered highly unlikely.</w:t>
-      </w:r>
-    </w:p>
-    <w:p>
-      <w:pPr>
-        <w:pStyle w:val="Compact"/>
-        <w:numPr>
-          <w:ilvl w:val="0"/>
-          <w:numId w:val="1003"/>
-        </w:numPr>
-      </w:pPr>
-      <w:r>
-        <w:t xml:space="preserve">Sub-variant C2: Cloudinary configures a cross-account S3 replication or</w:t>
-      </w:r>
-      <w:r>
-        <w:t xml:space="preserve"> </w:t>
-      </w:r>
-      <w:r>
-        <w:rPr>
-          <w:rStyle w:val="VerbatimChar"/>
-        </w:rPr>
-        <w:t xml:space="preserve">CopyObject</w:t>
-      </w:r>
-      <w:r>
-        <w:t xml:space="preserve"> </w:t>
-      </w:r>
-      <w:r>
-        <w:t xml:space="preserve">permission from their internal bucket to UTA’s S3. This is more realistic but depends entirely on Cloudinary PS willingness to expose their internal bucket.</w:t>
-      </w:r>
-    </w:p>
-    <w:p>
-      <w:pPr>
-        <w:pStyle w:val="Compact"/>
-        <w:numPr>
-          <w:ilvl w:val="0"/>
-          <w:numId w:val="1003"/>
-        </w:numPr>
-      </w:pPr>
-      <w:r>
-        <w:t xml:space="preserve">If feasible, this would be the fastest path for raw data transfer (server-side, zero egress cost).</w:t>
-      </w:r>
-    </w:p>
-    <w:p>
-      <w:r>
-        <w:pict>
-          <v:rect style="width:0;height:1.5pt" o:hralign="center" o:hrstd="t" o:hr="t"/>
-        </w:pict>
-      </w:r>
-    </w:p>
-    <w:bookmarkEnd w:id="15"/>
-    <w:bookmarkEnd w:id="16"/>
-    <w:bookmarkStart w:id="17" w:name="comparison-table"/>
+    <w:bookmarkEnd w:id="10"/>
+    <w:bookmarkStart w:id="11" w:name="X8a87c44989b82a25f9cfdc3398b7302da36dabb"/>
     <w:p>
       <w:pPr>
         <w:pStyle w:val="Heading2"/>
       </w:pPr>
       <w:r>
-        <w:t xml:space="preserve">Comparison Table</w:t>
+        <w:t xml:space="preserve">What Q&amp;A 3 Confirmed (Key Inputs to This Analysis)</w:t>
       </w:r>
     </w:p>
     <w:tbl>
@@ -577,10 +229,8 @@
         <w:tblLook w:firstRow="1" w:lastRow="0" w:firstColumn="0" w:lastColumn="0" w:noHBand="0" w:noVBand="0" w:val="0020"/>
       </w:tblPr>
       <w:tblGrid>
-        <w:gridCol w:w="1320"/>
-        <w:gridCol w:w="2200"/>
-        <w:gridCol w:w="2200"/>
-        <w:gridCol w:w="2200"/>
+        <w:gridCol w:w="3960"/>
+        <w:gridCol w:w="3960"/>
       </w:tblGrid>
       <w:tr>
         <w:trPr>
@@ -593,6 +243,872 @@
               <w:pStyle w:val="Compact"/>
             </w:pPr>
             <w:r>
+              <w:t xml:space="preserve">Question (prev. open)</w:t>
+            </w:r>
+          </w:p>
+        </w:tc>
+        <w:tc>
+          <w:tcPr/>
+          <w:p>
+            <w:pPr>
+              <w:pStyle w:val="Compact"/>
+            </w:pPr>
+            <w:r>
+              <w:t xml:space="preserve">Answer Confirmed</w:t>
+            </w:r>
+          </w:p>
+        </w:tc>
+      </w:tr>
+      <w:tr>
+        <w:tc>
+          <w:tcPr/>
+          <w:p>
+            <w:pPr>
+              <w:pStyle w:val="Compact"/>
+            </w:pPr>
+            <w:r>
+              <w:t xml:space="preserve">Does</w:t>
+            </w:r>
+            <w:r>
+              <w:t xml:space="preserve"> </w:t>
+            </w:r>
+            <w:r>
+              <w:rPr>
+                <w:rStyle w:val="VerbatimChar"/>
+              </w:rPr>
+              <w:t xml:space="preserve">cld clone</w:t>
+            </w:r>
+            <w:r>
+              <w:t xml:space="preserve"> </w:t>
+            </w:r>
+            <w:r>
+              <w:t xml:space="preserve">copy binary assets + metadata?</w:t>
+            </w:r>
+          </w:p>
+        </w:tc>
+        <w:tc>
+          <w:tcPr/>
+          <w:p>
+            <w:pPr>
+              <w:pStyle w:val="Compact"/>
+            </w:pPr>
+            <w:r>
+              <w:rPr>
+                <w:b/>
+                <w:bCs/>
+              </w:rPr>
+              <w:t xml:space="preserve">Yes — server-side, no intermediary machine.</w:t>
+            </w:r>
+            <w:r>
+              <w:t xml:space="preserve"> </w:t>
+            </w:r>
+            <w:r>
+              <w:t xml:space="preserve">Copies binaries +</w:t>
+            </w:r>
+            <w:r>
+              <w:t xml:space="preserve"> </w:t>
+            </w:r>
+            <w:r>
+              <w:rPr>
+                <w:rStyle w:val="VerbatimChar"/>
+              </w:rPr>
+              <w:t xml:space="preserve">public_id</w:t>
+            </w:r>
+            <w:r>
+              <w:t xml:space="preserve">, tags, context fields.</w:t>
+            </w:r>
+          </w:p>
+        </w:tc>
+      </w:tr>
+      <w:tr>
+        <w:tc>
+          <w:tcPr/>
+          <w:p>
+            <w:pPr>
+              <w:pStyle w:val="Compact"/>
+            </w:pPr>
+            <w:r>
+              <w:t xml:space="preserve">Is the copy server-side or through the client?</w:t>
+            </w:r>
+          </w:p>
+        </w:tc>
+        <w:tc>
+          <w:tcPr/>
+          <w:p>
+            <w:pPr>
+              <w:pStyle w:val="Compact"/>
+            </w:pPr>
+            <w:r>
+              <w:rPr>
+                <w:b/>
+                <w:bCs/>
+              </w:rPr>
+              <w:t xml:space="preserve">Server-side.</w:t>
+            </w:r>
+            <w:r>
+              <w:t xml:space="preserve"> </w:t>
+            </w:r>
+            <w:r>
+              <w:t xml:space="preserve">No EC2/bandwidth required for binary transfer.</w:t>
+            </w:r>
+          </w:p>
+        </w:tc>
+      </w:tr>
+      <w:tr>
+        <w:tc>
+          <w:tcPr/>
+          <w:p>
+            <w:pPr>
+              <w:pStyle w:val="Compact"/>
+            </w:pPr>
+            <w:r>
+              <w:t xml:space="preserve">Does</w:t>
+            </w:r>
+            <w:r>
+              <w:t xml:space="preserve"> </w:t>
+            </w:r>
+            <w:r>
+              <w:rPr>
+                <w:rStyle w:val="VerbatimChar"/>
+              </w:rPr>
+              <w:t xml:space="preserve">cld clone</w:t>
+            </w:r>
+            <w:r>
+              <w:t xml:space="preserve"> </w:t>
+            </w:r>
+            <w:r>
+              <w:t xml:space="preserve">preserve</w:t>
+            </w:r>
+            <w:r>
+              <w:t xml:space="preserve"> </w:t>
+            </w:r>
+            <w:r>
+              <w:rPr>
+                <w:rStyle w:val="VerbatimChar"/>
+              </w:rPr>
+              <w:t xml:space="preserve">public_id</w:t>
+            </w:r>
+            <w:r>
+              <w:t xml:space="preserve">, tags, context?</w:t>
+            </w:r>
+          </w:p>
+        </w:tc>
+        <w:tc>
+          <w:tcPr/>
+          <w:p>
+            <w:pPr>
+              <w:pStyle w:val="Compact"/>
+            </w:pPr>
+            <w:r>
+              <w:rPr>
+                <w:b/>
+                <w:bCs/>
+              </w:rPr>
+              <w:t xml:space="preserve">Yes.</w:t>
+            </w:r>
+            <w:r>
+              <w:t xml:space="preserve"> </w:t>
+            </w:r>
+            <w:r>
+              <w:t xml:space="preserve">Fully preserved.</w:t>
+            </w:r>
+          </w:p>
+        </w:tc>
+      </w:tr>
+      <w:tr>
+        <w:tc>
+          <w:tcPr/>
+          <w:p>
+            <w:pPr>
+              <w:pStyle w:val="Compact"/>
+            </w:pPr>
+            <w:r>
+              <w:t xml:space="preserve">Is structured metadata (taxonomy) copied by</w:t>
+            </w:r>
+            <w:r>
+              <w:t xml:space="preserve"> </w:t>
+            </w:r>
+            <w:r>
+              <w:rPr>
+                <w:rStyle w:val="VerbatimChar"/>
+              </w:rPr>
+              <w:t xml:space="preserve">cld clone</w:t>
+            </w:r>
+            <w:r>
+              <w:t xml:space="preserve">?</w:t>
+            </w:r>
+          </w:p>
+        </w:tc>
+        <w:tc>
+          <w:tcPr/>
+          <w:p>
+            <w:pPr>
+              <w:pStyle w:val="Compact"/>
+            </w:pPr>
+            <w:r>
+              <w:rPr>
+                <w:b/>
+                <w:bCs/>
+              </w:rPr>
+              <w:t xml:space="preserve">No.</w:t>
+            </w:r>
+            <w:r>
+              <w:t xml:space="preserve"> </w:t>
+            </w:r>
+            <w:r>
+              <w:t xml:space="preserve">Structured metadata taxonomy requires a separate bulk export → re-import step.</w:t>
+            </w:r>
+          </w:p>
+        </w:tc>
+      </w:tr>
+      <w:tr>
+        <w:tc>
+          <w:tcPr/>
+          <w:p>
+            <w:pPr>
+              <w:pStyle w:val="Compact"/>
+            </w:pPr>
+            <w:r>
+              <w:t xml:space="preserve">Are upload presets and env config copied?</w:t>
+            </w:r>
+          </w:p>
+        </w:tc>
+        <w:tc>
+          <w:tcPr/>
+          <w:p>
+            <w:pPr>
+              <w:pStyle w:val="Compact"/>
+            </w:pPr>
+            <w:r>
+              <w:rPr>
+                <w:b/>
+                <w:bCs/>
+              </w:rPr>
+              <w:t xml:space="preserve">No.</w:t>
+            </w:r>
+            <w:r>
+              <w:t xml:space="preserve"> </w:t>
+            </w:r>
+            <w:r>
+              <w:t xml:space="preserve">Must be independently reconfigured on the new environment.</w:t>
+            </w:r>
+          </w:p>
+        </w:tc>
+      </w:tr>
+      <w:tr>
+        <w:tc>
+          <w:tcPr/>
+          <w:p>
+            <w:pPr>
+              <w:pStyle w:val="Compact"/>
+            </w:pPr>
+            <w:r>
+              <w:t xml:space="preserve">Does</w:t>
+            </w:r>
+            <w:r>
+              <w:t xml:space="preserve"> </w:t>
+            </w:r>
+            <w:r>
+              <w:rPr>
+                <w:rStyle w:val="VerbatimChar"/>
+              </w:rPr>
+              <w:t xml:space="preserve">cld clone</w:t>
+            </w:r>
+            <w:r>
+              <w:t xml:space="preserve"> </w:t>
+            </w:r>
+            <w:r>
+              <w:t xml:space="preserve">support incremental / phased execution?</w:t>
+            </w:r>
+          </w:p>
+        </w:tc>
+        <w:tc>
+          <w:tcPr/>
+          <w:p>
+            <w:pPr>
+              <w:pStyle w:val="Compact"/>
+            </w:pPr>
+            <w:r>
+              <w:rPr>
+                <w:b/>
+                <w:bCs/>
+              </w:rPr>
+              <w:t xml:space="preserve">Yes.</w:t>
+            </w:r>
+            <w:r>
+              <w:t xml:space="preserve"> </w:t>
+            </w:r>
+            <w:r>
+              <w:t xml:space="preserve">Supports search expressions to clone subsets (by folder, prefix, etc.).</w:t>
+            </w:r>
+          </w:p>
+        </w:tc>
+      </w:tr>
+      <w:tr>
+        <w:tc>
+          <w:tcPr/>
+          <w:p>
+            <w:pPr>
+              <w:pStyle w:val="Compact"/>
+            </w:pPr>
+            <w:r>
+              <w:t xml:space="preserve">Is there an async mode for large datasets?</w:t>
+            </w:r>
+          </w:p>
+        </w:tc>
+        <w:tc>
+          <w:tcPr/>
+          <w:p>
+            <w:pPr>
+              <w:pStyle w:val="Compact"/>
+            </w:pPr>
+            <w:r>
+              <w:rPr>
+                <w:b/>
+                <w:bCs/>
+              </w:rPr>
+              <w:t xml:space="preserve">Yes.</w:t>
+            </w:r>
+            <w:r>
+              <w:t xml:space="preserve"> </w:t>
+            </w:r>
+            <w:r>
+              <w:t xml:space="preserve">Async option available + webhook notifications on completion.</w:t>
+            </w:r>
+          </w:p>
+        </w:tc>
+      </w:tr>
+      <w:tr>
+        <w:tc>
+          <w:tcPr/>
+          <w:p>
+            <w:pPr>
+              <w:pStyle w:val="Compact"/>
+            </w:pPr>
+            <w:r>
+              <w:t xml:space="preserve">Does</w:t>
+            </w:r>
+            <w:r>
+              <w:t xml:space="preserve"> </w:t>
+            </w:r>
+            <w:r>
+              <w:rPr>
+                <w:rStyle w:val="VerbatimChar"/>
+              </w:rPr>
+              <w:t xml:space="preserve">cld sync</w:t>
+            </w:r>
+            <w:r>
+              <w:t xml:space="preserve"> </w:t>
+            </w:r>
+            <w:r>
+              <w:t xml:space="preserve">support environment-to-environment?</w:t>
+            </w:r>
+          </w:p>
+        </w:tc>
+        <w:tc>
+          <w:tcPr/>
+          <w:p>
+            <w:pPr>
+              <w:pStyle w:val="Compact"/>
+            </w:pPr>
+            <w:r>
+              <w:rPr>
+                <w:b/>
+                <w:bCs/>
+              </w:rPr>
+              <w:t xml:space="preserve">No.</w:t>
+            </w:r>
+            <w:r>
+              <w:t xml:space="preserve"> </w:t>
+            </w:r>
+            <w:r>
+              <w:rPr>
+                <w:rStyle w:val="VerbatimChar"/>
+              </w:rPr>
+              <w:t xml:space="preserve">cld sync</w:t>
+            </w:r>
+            <w:r>
+              <w:t xml:space="preserve"> </w:t>
+            </w:r>
+            <w:r>
+              <w:t xml:space="preserve">is local filesystem ↔ Cloudinary only. Eliminated as a migration tool.</w:t>
+            </w:r>
+          </w:p>
+        </w:tc>
+      </w:tr>
+      <w:tr>
+        <w:tc>
+          <w:tcPr/>
+          <w:p>
+            <w:pPr>
+              <w:pStyle w:val="Compact"/>
+            </w:pPr>
+            <w:r>
+              <w:t xml:space="preserve">When does PS configure BYOB?</w:t>
+            </w:r>
+          </w:p>
+        </w:tc>
+        <w:tc>
+          <w:tcPr/>
+          <w:p>
+            <w:pPr>
+              <w:pStyle w:val="Compact"/>
+            </w:pPr>
+            <w:r>
+              <w:rPr>
+                <w:b/>
+                <w:bCs/>
+              </w:rPr>
+              <w:t xml:space="preserve">Before the clone runs.</w:t>
+            </w:r>
+            <w:r>
+              <w:t xml:space="preserve"> </w:t>
+            </w:r>
+            <w:r>
+              <w:t xml:space="preserve">BYOB is a prerequisite for</w:t>
+            </w:r>
+            <w:r>
+              <w:t xml:space="preserve"> </w:t>
+            </w:r>
+            <w:r>
+              <w:rPr>
+                <w:rStyle w:val="VerbatimChar"/>
+              </w:rPr>
+              <w:t xml:space="preserve">cld clone</w:t>
+            </w:r>
+            <w:r>
+              <w:t xml:space="preserve"> </w:t>
+            </w:r>
+            <w:r>
+              <w:t xml:space="preserve">to write to UTA S3.</w:t>
+            </w:r>
+          </w:p>
+        </w:tc>
+      </w:tr>
+      <w:tr>
+        <w:tc>
+          <w:tcPr/>
+          <w:p>
+            <w:pPr>
+              <w:pStyle w:val="Compact"/>
+            </w:pPr>
+            <w:r>
+              <w:t xml:space="preserve">CDN cache behavior at CNAME cutover</w:t>
+            </w:r>
+          </w:p>
+        </w:tc>
+        <w:tc>
+          <w:tcPr/>
+          <w:p>
+            <w:pPr>
+              <w:pStyle w:val="Compact"/>
+            </w:pPr>
+            <w:r>
+              <w:t xml:space="preserve">If CNAME is preserved, cached content continues to be served correctly; cache purge may not be needed. (PS to confirm.)</w:t>
+            </w:r>
+          </w:p>
+        </w:tc>
+      </w:tr>
+      <w:tr>
+        <w:tc>
+          <w:tcPr/>
+          <w:p>
+            <w:pPr>
+              <w:pStyle w:val="Compact"/>
+            </w:pPr>
+            <w:r>
+              <w:t xml:space="preserve">S3 key naming convention under BYOB</w:t>
+            </w:r>
+          </w:p>
+        </w:tc>
+        <w:tc>
+          <w:tcPr/>
+          <w:p>
+            <w:pPr>
+              <w:pStyle w:val="Compact"/>
+            </w:pPr>
+            <w:r>
+              <w:rPr>
+                <w:b/>
+                <w:bCs/>
+              </w:rPr>
+              <w:t xml:space="preserve">Deferred to PS scoping.</w:t>
+            </w:r>
+            <w:r>
+              <w:t xml:space="preserve"> </w:t>
+            </w:r>
+            <w:r>
+              <w:t xml:space="preserve">UTA control over key structure is unknown.</w:t>
+            </w:r>
+          </w:p>
+        </w:tc>
+      </w:tr>
+      <w:tr>
+        <w:tc>
+          <w:tcPr/>
+          <w:p>
+            <w:pPr>
+              <w:pStyle w:val="Compact"/>
+            </w:pPr>
+            <w:r>
+              <w:t xml:space="preserve">Cross-account S3 copy feasibility</w:t>
+            </w:r>
+          </w:p>
+        </w:tc>
+        <w:tc>
+          <w:tcPr/>
+          <w:p>
+            <w:pPr>
+              <w:pStyle w:val="Compact"/>
+            </w:pPr>
+            <w:r>
+              <w:rPr>
+                <w:b/>
+                <w:bCs/>
+              </w:rPr>
+              <w:t xml:space="preserve">Deferred to PS scoping.</w:t>
+            </w:r>
+            <w:r>
+              <w:t xml:space="preserve"> </w:t>
+            </w:r>
+            <w:r>
+              <w:t xml:space="preserve">Not a planning basis.</w:t>
+            </w:r>
+          </w:p>
+        </w:tc>
+      </w:tr>
+    </w:tbl>
+    <w:p>
+      <w:r>
+        <w:pict>
+          <v:rect style="width:0;height:1.5pt" o:hralign="center" o:hrstd="t" o:hr="t"/>
+        </w:pict>
+      </w:r>
+    </w:p>
+    <w:bookmarkEnd w:id="11"/>
+    <w:bookmarkStart w:id="14" w:name="the-two-viable-options"/>
+    <w:p>
+      <w:pPr>
+        <w:pStyle w:val="Heading2"/>
+      </w:pPr>
+      <w:r>
+        <w:t xml:space="preserve">The Two Viable Options</w:t>
+      </w:r>
+    </w:p>
+    <w:bookmarkStart w:id="12" w:name="Xd2955983152fc5759d96bc24d7d02828f658e0e"/>
+    <w:p>
+      <w:pPr>
+        <w:pStyle w:val="Heading3"/>
+      </w:pPr>
+      <w:r>
+        <w:t xml:space="preserve">Option A —</w:t>
+      </w:r>
+      <w:r>
+        <w:t xml:space="preserve"> </w:t>
+      </w:r>
+      <w:r>
+        <w:rPr>
+          <w:rStyle w:val="VerbatimChar"/>
+        </w:rPr>
+        <w:t xml:space="preserve">cld clone</w:t>
+      </w:r>
+      <w:r>
+        <w:t xml:space="preserve"> </w:t>
+      </w:r>
+      <w:r>
+        <w:t xml:space="preserve">(Cloudinary-Native Migration)</w:t>
+      </w:r>
+    </w:p>
+    <w:p>
+      <w:pPr>
+        <w:pStyle w:val="FirstParagraph"/>
+      </w:pPr>
+      <w:r>
+        <w:t xml:space="preserve">PS configures the new Cloudinary environment with BYOB pointing to UTA’s S3 bucket. A</w:t>
+      </w:r>
+      <w:r>
+        <w:t xml:space="preserve"> </w:t>
+      </w:r>
+      <w:r>
+        <w:rPr>
+          <w:rStyle w:val="VerbatimChar"/>
+        </w:rPr>
+        <w:t xml:space="preserve">cld clone</w:t>
+      </w:r>
+      <w:r>
+        <w:t xml:space="preserve"> </w:t>
+      </w:r>
+      <w:r>
+        <w:t xml:space="preserve">command is then executed against the source environment. Cloudinary performs a</w:t>
+      </w:r>
+      <w:r>
+        <w:t xml:space="preserve"> </w:t>
+      </w:r>
+      <w:r>
+        <w:rPr>
+          <w:b/>
+          <w:bCs/>
+        </w:rPr>
+        <w:t xml:space="preserve">server-side copy</w:t>
+      </w:r>
+      <w:r>
+        <w:t xml:space="preserve"> </w:t>
+      </w:r>
+      <w:r>
+        <w:t xml:space="preserve">of all binary assets and most metadata directly into the new environment. Because the target environment is BYOB-backed, the binaries land in UTA’s S3 bucket automatically — no intermediate machine, no egress routing.</w:t>
+      </w:r>
+    </w:p>
+    <w:p>
+      <w:pPr>
+        <w:pStyle w:val="BodyText"/>
+      </w:pPr>
+      <w:r>
+        <w:t xml:space="preserve">The migration is completed in two additional steps:</w:t>
+      </w:r>
+      <w:r>
+        <w:t xml:space="preserve"> </w:t>
+      </w:r>
+      <w:r>
+        <w:t xml:space="preserve">1.</w:t>
+      </w:r>
+      <w:r>
+        <w:t xml:space="preserve"> </w:t>
+      </w:r>
+      <w:r>
+        <w:rPr>
+          <w:b/>
+          <w:bCs/>
+        </w:rPr>
+        <w:t xml:space="preserve">Structured metadata taxonomy</w:t>
+      </w:r>
+      <w:r>
+        <w:t xml:space="preserve"> </w:t>
+      </w:r>
+      <w:r>
+        <w:t xml:space="preserve">is bulk-exported from the source environment and re-imported into the new environment via the Admin API.</w:t>
+      </w:r>
+      <w:r>
+        <w:t xml:space="preserve"> </w:t>
+      </w:r>
+      <w:r>
+        <w:t xml:space="preserve">2.</w:t>
+      </w:r>
+      <w:r>
+        <w:t xml:space="preserve"> </w:t>
+      </w:r>
+      <w:r>
+        <w:rPr>
+          <w:b/>
+          <w:bCs/>
+        </w:rPr>
+        <w:t xml:space="preserve">Upload presets and environment configuration</w:t>
+      </w:r>
+      <w:r>
+        <w:t xml:space="preserve"> </w:t>
+      </w:r>
+      <w:r>
+        <w:t xml:space="preserve">are manually reconfigured on the new environment.</w:t>
+      </w:r>
+    </w:p>
+    <w:p>
+      <w:pPr>
+        <w:pStyle w:val="BodyText"/>
+      </w:pPr>
+      <w:r>
+        <w:rPr>
+          <w:rStyle w:val="VerbatimChar"/>
+        </w:rPr>
+        <w:t xml:space="preserve">cld clone</w:t>
+      </w:r>
+      <w:r>
+        <w:t xml:space="preserve"> </w:t>
+      </w:r>
+      <w:r>
+        <w:t xml:space="preserve">supports</w:t>
+      </w:r>
+      <w:r>
+        <w:t xml:space="preserve"> </w:t>
+      </w:r>
+      <w:r>
+        <w:rPr>
+          <w:b/>
+          <w:bCs/>
+        </w:rPr>
+        <w:t xml:space="preserve">search expressions</w:t>
+      </w:r>
+      <w:r>
+        <w:t xml:space="preserve"> </w:t>
+      </w:r>
+      <w:r>
+        <w:t xml:space="preserve">so the operation can be scoped to folders or subsets for phased execution and validation before committing to the full ~3 TB. An</w:t>
+      </w:r>
+      <w:r>
+        <w:t xml:space="preserve"> </w:t>
+      </w:r>
+      <w:r>
+        <w:rPr>
+          <w:b/>
+          <w:bCs/>
+        </w:rPr>
+        <w:t xml:space="preserve">async flag + webhook</w:t>
+      </w:r>
+      <w:r>
+        <w:t xml:space="preserve"> </w:t>
+      </w:r>
+      <w:r>
+        <w:t xml:space="preserve">notification is available for long-running operations.</w:t>
+      </w:r>
+    </w:p>
+    <w:p>
+      <w:pPr>
+        <w:pStyle w:val="BodyText"/>
+      </w:pPr>
+      <w:r>
+        <w:rPr>
+          <w:b/>
+          <w:bCs/>
+        </w:rPr>
+        <w:t xml:space="preserve">Implementation effort:</w:t>
+      </w:r>
+      <w:r>
+        <w:t xml:space="preserve"> </w:t>
+      </w:r>
+      <w:r>
+        <w:t xml:space="preserve">Low engineering — primarily operational. PS handles BYOB setup; delivery team handles structured metadata export/import scripting and env config replication.</w:t>
+      </w:r>
+    </w:p>
+    <w:p>
+      <w:r>
+        <w:pict>
+          <v:rect style="width:0;height:1.5pt" o:hralign="center" o:hrstd="t" o:hr="t"/>
+        </w:pict>
+      </w:r>
+    </w:p>
+    <w:bookmarkEnd w:id="12"/>
+    <w:bookmarkStart w:id="13" w:name="X2db17137e4b8fb8730019d94b6bf3be80d3df6c"/>
+    <w:p>
+      <w:pPr>
+        <w:pStyle w:val="Heading3"/>
+      </w:pPr>
+      <w:r>
+        <w:t xml:space="preserve">Option B — Worker Fleet (Custom Uploader Loop)</w:t>
+      </w:r>
+    </w:p>
+    <w:p>
+      <w:pPr>
+        <w:pStyle w:val="FirstParagraph"/>
+      </w:pPr>
+      <w:r>
+        <w:t xml:space="preserve">A purpose-built migration engine: a Python controller enumerates all asset</w:t>
+      </w:r>
+      <w:r>
+        <w:t xml:space="preserve"> </w:t>
+      </w:r>
+      <w:r>
+        <w:rPr>
+          <w:rStyle w:val="VerbatimChar"/>
+        </w:rPr>
+        <w:t xml:space="preserve">public_id</w:t>
+      </w:r>
+      <w:r>
+        <w:t xml:space="preserve">s from the source environment (via Admin API, respecting the 5,000 req/hr rate limit), then enqueues them into SQS. Stateless workers pull from the queue, download each binary from the source Cloudinary environment (or its CDN), and re-upload it to the new Cloudinary environment via the</w:t>
+      </w:r>
+      <w:r>
+        <w:t xml:space="preserve"> </w:t>
+      </w:r>
+      <w:r>
+        <w:rPr>
+          <w:b/>
+          <w:bCs/>
+        </w:rPr>
+        <w:t xml:space="preserve">Cloudinary Upload API</w:t>
+      </w:r>
+      <w:r>
+        <w:t xml:space="preserve"> </w:t>
+      </w:r>
+      <w:r>
+        <w:t xml:space="preserve">— which, with BYOB active on the target environment, writes binaries to UTA S3 automatically. Per-asset metadata — tags, context, structured metadata fields — is explicitly written during the upload or via a subsequent Admin API call.</w:t>
+      </w:r>
+    </w:p>
+    <w:p>
+      <w:pPr>
+        <w:pStyle w:val="BodyText"/>
+      </w:pPr>
+      <w:r>
+        <w:t xml:space="preserve">DynamoDB tracks per-asset state (status, attempts, errors,</w:t>
+      </w:r>
+      <w:r>
+        <w:t xml:space="preserve"> </w:t>
+      </w:r>
+      <w:r>
+        <w:rPr>
+          <w:rStyle w:val="VerbatimChar"/>
+        </w:rPr>
+        <w:t xml:space="preserve">s3_etag</w:t>
+      </w:r>
+      <w:r>
+        <w:t xml:space="preserve">). CloudWatch and Datadog provide real-time observability. A dead-letter queue captures failures for targeted remediation.</w:t>
+      </w:r>
+    </w:p>
+    <w:p>
+      <w:pPr>
+        <w:pStyle w:val="BodyText"/>
+      </w:pPr>
+      <w:r>
+        <w:rPr>
+          <w:b/>
+          <w:bCs/>
+        </w:rPr>
+        <w:t xml:space="preserve">Implementation effort:</w:t>
+      </w:r>
+      <w:r>
+        <w:t xml:space="preserve"> </w:t>
+      </w:r>
+      <w:r>
+        <w:t xml:space="preserve">High engineering — full controller + worker + infra build-out (ECS/Batch, SQS, DynamoDB, CloudWatch). Full programmatic control over every asset.</w:t>
+      </w:r>
+    </w:p>
+    <w:p>
+      <w:r>
+        <w:pict>
+          <v:rect style="width:0;height:1.5pt" o:hralign="center" o:hrstd="t" o:hr="t"/>
+        </w:pict>
+      </w:r>
+    </w:p>
+    <w:bookmarkEnd w:id="13"/>
+    <w:bookmarkEnd w:id="14"/>
+    <w:bookmarkStart w:id="15" w:name="comparison-table"/>
+    <w:p>
+      <w:pPr>
+        <w:pStyle w:val="Heading2"/>
+      </w:pPr>
+      <w:r>
+        <w:t xml:space="preserve">Comparison Table</w:t>
+      </w:r>
+    </w:p>
+    <w:tbl>
+      <w:tblPr>
+        <w:tblStyle w:val="Table"/>
+        <w:tblW w:type="pct" w:w="5000"/>
+        <w:tblLayout w:type="fixed"/>
+        <w:tblLook w:firstRow="1" w:lastRow="0" w:firstColumn="0" w:lastColumn="0" w:noHBand="0" w:noVBand="0" w:val="0020"/>
+      </w:tblPr>
+      <w:tblGrid>
+        <w:gridCol w:w="1827"/>
+        <w:gridCol w:w="3046"/>
+        <w:gridCol w:w="3046"/>
+      </w:tblGrid>
+      <w:tr>
+        <w:trPr>
+          <w:tblHeader w:val="on"/>
+        </w:trPr>
+        <w:tc>
+          <w:tcPr/>
+          <w:p>
+            <w:pPr>
+              <w:pStyle w:val="Compact"/>
+            </w:pPr>
+            <w:r>
               <w:t xml:space="preserve">Quality Attribute</w:t>
             </w:r>
           </w:p>
@@ -609,7 +1125,22 @@
                 <w:b/>
                 <w:bCs/>
               </w:rPr>
-              <w:t xml:space="preserve">A — CLI Sync / Clone</w:t>
+              <w:t xml:space="preserve">A —</w:t>
+            </w:r>
+            <w:r>
+              <w:rPr>
+                <w:b/>
+                <w:bCs/>
+              </w:rPr>
+              <w:t xml:space="preserve"> </w:t>
+            </w:r>
+            <w:r>
+              <w:rPr>
+                <w:rStyle w:val="VerbatimChar"/>
+                <w:b/>
+                <w:bCs/>
+              </w:rPr>
+              <w:t xml:space="preserve">cld clone</w:t>
             </w:r>
           </w:p>
         </w:tc>
@@ -625,7 +1156,24 @@
                 <w:b/>
                 <w:bCs/>
               </w:rPr>
-              <w:t xml:space="preserve">B — Worker Fleet (Python SDK)</w:t>
+              <w:t xml:space="preserve">B — Worker Fleet (Upload API Loop)</w:t>
+            </w:r>
+          </w:p>
+        </w:tc>
+      </w:tr>
+      <w:tr>
+        <w:tc>
+          <w:tcPr/>
+          <w:p>
+            <w:pPr>
+              <w:pStyle w:val="Compact"/>
+            </w:pPr>
+            <w:r>
+              <w:rPr>
+                <w:b/>
+                <w:bCs/>
+              </w:rPr>
+              <w:t xml:space="preserve">Feasibility (confirmed)</w:t>
             </w:r>
           </w:p>
         </w:tc>
@@ -637,28 +1185,7 @@
               <w:jc w:val="center"/>
             </w:pPr>
             <w:r>
-              <w:rPr>
-                <w:b/>
-                <w:bCs/>
-              </w:rPr>
-              <w:t xml:space="preserve">C — S3 Ownership / Cross-Account Copy</w:t>
-            </w:r>
-          </w:p>
-        </w:tc>
-      </w:tr>
-      <w:tr>
-        <w:tc>
-          <w:tcPr/>
-          <w:p>
-            <w:pPr>
-              <w:pStyle w:val="Compact"/>
-            </w:pPr>
-            <w:r>
-              <w:rPr>
-                <w:b/>
-                <w:bCs/>
-              </w:rPr>
-              <w:t xml:space="preserve">Feasibility (confirmed)</w:t>
+              <w:t xml:space="preserve">✅ Core behavior confirmed by Q&amp;A 3</w:t>
             </w:r>
           </w:p>
         </w:tc>
@@ -670,7 +1197,24 @@
               <w:jc w:val="center"/>
             </w:pPr>
             <w:r>
-              <w:t xml:space="preserve">🟡 Partially unknown</w:t>
+              <w:t xml:space="preserve">✅ Fully understood</w:t>
+            </w:r>
+          </w:p>
+        </w:tc>
+      </w:tr>
+      <w:tr>
+        <w:tc>
+          <w:tcPr/>
+          <w:p>
+            <w:pPr>
+              <w:pStyle w:val="Compact"/>
+            </w:pPr>
+            <w:r>
+              <w:rPr>
+                <w:b/>
+                <w:bCs/>
+              </w:rPr>
+              <w:t xml:space="preserve">Binary Transfer Method</w:t>
             </w:r>
           </w:p>
         </w:tc>
@@ -682,7 +1226,7 @@
               <w:jc w:val="center"/>
             </w:pPr>
             <w:r>
-              <w:t xml:space="preserve">✅ Fully understood</w:t>
+              <w:t xml:space="preserve">✅ Server-side (Cloudinary-to-Cloudinary → UTA S3) — no intermediary</w:t>
             </w:r>
           </w:p>
         </w:tc>
@@ -694,24 +1238,24 @@
               <w:jc w:val="center"/>
             </w:pPr>
             <w:r>
-              <w:t xml:space="preserve">🔴 High uncertainty</w:t>
-            </w:r>
-          </w:p>
-        </w:tc>
-      </w:tr>
-      <w:tr>
-        <w:tc>
-          <w:tcPr/>
-          <w:p>
-            <w:pPr>
-              <w:pStyle w:val="Compact"/>
-            </w:pPr>
-            <w:r>
-              <w:rPr>
-                <w:b/>
-                <w:bCs/>
-              </w:rPr>
-              <w:t xml:space="preserve">Metadata Migration</w:t>
+              <w:t xml:space="preserve">🟡 Client-mediated — workers download + re-upload via Upload API</w:t>
+            </w:r>
+          </w:p>
+        </w:tc>
+      </w:tr>
+      <w:tr>
+        <w:tc>
+          <w:tcPr/>
+          <w:p>
+            <w:pPr>
+              <w:pStyle w:val="Compact"/>
+            </w:pPr>
+            <w:r>
+              <w:rPr>
+                <w:b/>
+                <w:bCs/>
+              </w:rPr>
+              <w:t xml:space="preserve">Data Egress Cost</w:t>
             </w:r>
           </w:p>
         </w:tc>
@@ -723,7 +1267,7 @@
               <w:jc w:val="center"/>
             </w:pPr>
             <w:r>
-              <w:t xml:space="preserve">🟡 Unknown (depends on CLI behavior)</w:t>
+              <w:t xml:space="preserve">✅ Zero — server-side copy, no bandwidth through intermediary</w:t>
             </w:r>
           </w:p>
         </w:tc>
@@ -735,7 +1279,24 @@
               <w:jc w:val="center"/>
             </w:pPr>
             <w:r>
-              <w:t xml:space="preserve">✅ Explicit — per-asset API call</w:t>
+              <w:t xml:space="preserve">🔴 Incurred — download from source Cloudinary + re-upload to new env</w:t>
+            </w:r>
+          </w:p>
+        </w:tc>
+      </w:tr>
+      <w:tr>
+        <w:tc>
+          <w:tcPr/>
+          <w:p>
+            <w:pPr>
+              <w:pStyle w:val="Compact"/>
+            </w:pPr>
+            <w:r>
+              <w:rPr>
+                <w:b/>
+                <w:bCs/>
+              </w:rPr>
+              <w:t xml:space="preserve">Transfer Speed (~3 TB)</w:t>
             </w:r>
           </w:p>
         </w:tc>
@@ -747,7 +1308,19 @@
               <w:jc w:val="center"/>
             </w:pPr>
             <w:r>
-              <w:t xml:space="preserve">🔴 Not inherent — separate step required</w:t>
+              <w:t xml:space="preserve">✅ Fast — server-side, no client bandwidth constraint</w:t>
+            </w:r>
+          </w:p>
+        </w:tc>
+        <w:tc>
+          <w:tcPr/>
+          <w:p>
+            <w:pPr>
+              <w:pStyle w:val="Compact"/>
+              <w:jc w:val="center"/>
+            </w:pPr>
+            <w:r>
+              <w:t xml:space="preserve">🟡 Tunable via worker concurrency; bounded by API throughput and bandwidth</w:t>
             </w:r>
           </w:p>
         </w:tc>
@@ -791,7 +1364,7 @@
               <w:jc w:val="center"/>
             </w:pPr>
             <w:r>
-              <w:t xml:space="preserve">🟡 Assumed yes for</w:t>
+              <w:t xml:space="preserve">✅ Confirmed preserved by</w:t>
             </w:r>
             <w:r>
               <w:t xml:space="preserve"> </w:t>
@@ -800,10 +1373,48 @@
               <w:rPr>
                 <w:rStyle w:val="VerbatimChar"/>
               </w:rPr>
-              <w:t xml:space="preserve">clone</w:t>
-            </w:r>
-            <w:r>
-              <w:t xml:space="preserve">; unclear for</w:t>
+              <w:t xml:space="preserve">cld clone</w:t>
+            </w:r>
+          </w:p>
+        </w:tc>
+        <w:tc>
+          <w:tcPr/>
+          <w:p>
+            <w:pPr>
+              <w:pStyle w:val="Compact"/>
+              <w:jc w:val="center"/>
+            </w:pPr>
+            <w:r>
+              <w:t xml:space="preserve">✅ Guaranteed by design</w:t>
+            </w:r>
+          </w:p>
+        </w:tc>
+      </w:tr>
+      <w:tr>
+        <w:tc>
+          <w:tcPr/>
+          <w:p>
+            <w:pPr>
+              <w:pStyle w:val="Compact"/>
+            </w:pPr>
+            <w:r>
+              <w:rPr>
+                <w:b/>
+                <w:bCs/>
+              </w:rPr>
+              <w:t xml:space="preserve">Tags + Context Metadata</w:t>
+            </w:r>
+          </w:p>
+        </w:tc>
+        <w:tc>
+          <w:tcPr/>
+          <w:p>
+            <w:pPr>
+              <w:pStyle w:val="Compact"/>
+              <w:jc w:val="center"/>
+            </w:pPr>
+            <w:r>
+              <w:t xml:space="preserve">✅ Preserved automatically by</w:t>
             </w:r>
             <w:r>
               <w:t xml:space="preserve"> </w:t>
@@ -812,7 +1423,7 @@
               <w:rPr>
                 <w:rStyle w:val="VerbatimChar"/>
               </w:rPr>
-              <w:t xml:space="preserve">sync</w:t>
+              <w:t xml:space="preserve">cld clone</w:t>
             </w:r>
           </w:p>
         </w:tc>
@@ -824,7 +1435,24 @@
               <w:jc w:val="center"/>
             </w:pPr>
             <w:r>
-              <w:t xml:space="preserve">✅ Guaranteed by design</w:t>
+              <w:t xml:space="preserve">✅ Explicit per-asset write</w:t>
+            </w:r>
+          </w:p>
+        </w:tc>
+      </w:tr>
+      <w:tr>
+        <w:tc>
+          <w:tcPr/>
+          <w:p>
+            <w:pPr>
+              <w:pStyle w:val="Compact"/>
+            </w:pPr>
+            <w:r>
+              <w:rPr>
+                <w:b/>
+                <w:bCs/>
+              </w:rPr>
+              <w:t xml:space="preserve">Structured Metadata Taxonomy</w:t>
             </w:r>
           </w:p>
         </w:tc>
@@ -836,7 +1464,60 @@
               <w:jc w:val="center"/>
             </w:pPr>
             <w:r>
-              <w:t xml:space="preserve">🔴 Must be reconciled separately</w:t>
+              <w:t xml:space="preserve">🟡 Separate export → re-import step required (scripted, not automatic)</w:t>
+            </w:r>
+          </w:p>
+        </w:tc>
+        <w:tc>
+          <w:tcPr/>
+          <w:p>
+            <w:pPr>
+              <w:pStyle w:val="Compact"/>
+              <w:jc w:val="center"/>
+            </w:pPr>
+            <w:r>
+              <w:t xml:space="preserve">✅ Explicit per-asset write during migration — no separate step</w:t>
+            </w:r>
+          </w:p>
+        </w:tc>
+      </w:tr>
+      <w:tr>
+        <w:tc>
+          <w:tcPr/>
+          <w:p>
+            <w:pPr>
+              <w:pStyle w:val="Compact"/>
+            </w:pPr>
+            <w:r>
+              <w:rPr>
+                <w:b/>
+                <w:bCs/>
+              </w:rPr>
+              <w:t xml:space="preserve">Upload Presets / Env Config</w:t>
+            </w:r>
+          </w:p>
+        </w:tc>
+        <w:tc>
+          <w:tcPr/>
+          <w:p>
+            <w:pPr>
+              <w:pStyle w:val="Compact"/>
+              <w:jc w:val="center"/>
+            </w:pPr>
+            <w:r>
+              <w:t xml:space="preserve">🟡 Must be manually reconfigured on new environment</w:t>
+            </w:r>
+          </w:p>
+        </w:tc>
+        <w:tc>
+          <w:tcPr/>
+          <w:p>
+            <w:pPr>
+              <w:pStyle w:val="Compact"/>
+              <w:jc w:val="center"/>
+            </w:pPr>
+            <w:r>
+              <w:t xml:space="preserve">🟡 Same requirement — independent of migration option</w:t>
             </w:r>
           </w:p>
         </w:tc>
@@ -865,7 +1546,7 @@
               <w:jc w:val="center"/>
             </w:pPr>
             <w:r>
-              <w:t xml:space="preserve">🟡 Unknown — CLI may call Admin API internally</w:t>
+              <w:t xml:space="preserve">🟡 CLI may call Admin API internally; rate behavior at scale not confirmed</w:t>
             </w:r>
           </w:p>
         </w:tc>
@@ -877,7 +1558,24 @@
               <w:jc w:val="center"/>
             </w:pPr>
             <w:r>
-              <w:t xml:space="preserve">✅ Controlled — token-bucket rate limiter</w:t>
+              <w:t xml:space="preserve">✅ Controlled — token-bucket rate limiter, enumeration stays within 5,000 req/hr</w:t>
+            </w:r>
+          </w:p>
+        </w:tc>
+      </w:tr>
+      <w:tr>
+        <w:tc>
+          <w:tcPr/>
+          <w:p>
+            <w:pPr>
+              <w:pStyle w:val="Compact"/>
+            </w:pPr>
+            <w:r>
+              <w:rPr>
+                <w:b/>
+                <w:bCs/>
+              </w:rPr>
+              <w:t xml:space="preserve">Cloudinary PS Dependency</w:t>
             </w:r>
           </w:p>
         </w:tc>
@@ -889,24 +1587,7 @@
               <w:jc w:val="center"/>
             </w:pPr>
             <w:r>
-              <w:t xml:space="preserve">🟢 Minimal — no Cloudinary API calls for transfer</w:t>
-            </w:r>
-          </w:p>
-        </w:tc>
-      </w:tr>
-      <w:tr>
-        <w:tc>
-          <w:tcPr/>
-          <w:p>
-            <w:pPr>
-              <w:pStyle w:val="Compact"/>
-            </w:pPr>
-            <w:r>
-              <w:rPr>
-                <w:b/>
-                <w:bCs/>
-              </w:rPr>
-              <w:t xml:space="preserve">Cloudinary PS Dependency</w:t>
+              <w:t xml:space="preserve">🟡 High — BYOB setup + clone behavior must be validated by PS before execution</w:t>
             </w:r>
           </w:p>
         </w:tc>
@@ -918,7 +1599,24 @@
               <w:jc w:val="center"/>
             </w:pPr>
             <w:r>
-              <w:t xml:space="preserve">🔴 High — CLI behavior in cross-env + BYOB context must be validated by PS</w:t>
+              <w:t xml:space="preserve">🟡 Medium — PS scoped to BYOB setup only; migration engine is self-directed</w:t>
+            </w:r>
+          </w:p>
+        </w:tc>
+      </w:tr>
+      <w:tr>
+        <w:tc>
+          <w:tcPr/>
+          <w:p>
+            <w:pPr>
+              <w:pStyle w:val="Compact"/>
+            </w:pPr>
+            <w:r>
+              <w:rPr>
+                <w:b/>
+                <w:bCs/>
+              </w:rPr>
+              <w:t xml:space="preserve">Operational Visibility</w:t>
             </w:r>
           </w:p>
         </w:tc>
@@ -930,7 +1628,7 @@
               <w:jc w:val="center"/>
             </w:pPr>
             <w:r>
-              <w:t xml:space="preserve">🟡 Medium — PS scoped to BYOB setup only</w:t>
+              <w:t xml:space="preserve">🔴 Low — CLI is a black box; no per-asset state tracking</w:t>
             </w:r>
           </w:p>
         </w:tc>
@@ -942,24 +1640,24 @@
               <w:jc w:val="center"/>
             </w:pPr>
             <w:r>
-              <w:t xml:space="preserve">🔴 Very high — non-standard AWS + Cloudinary operation</w:t>
-            </w:r>
-          </w:p>
-        </w:tc>
-      </w:tr>
-      <w:tr>
-        <w:tc>
-          <w:tcPr/>
-          <w:p>
-            <w:pPr>
-              <w:pStyle w:val="Compact"/>
-            </w:pPr>
-            <w:r>
-              <w:rPr>
-                <w:b/>
-                <w:bCs/>
-              </w:rPr>
-              <w:t xml:space="preserve">Transfer Speed (~3 TB)</w:t>
+              <w:t xml:space="preserve">✅ Full — DynamoDB state, DLQ, CloudWatch, Datadog</w:t>
+            </w:r>
+          </w:p>
+        </w:tc>
+      </w:tr>
+      <w:tr>
+        <w:tc>
+          <w:tcPr/>
+          <w:p>
+            <w:pPr>
+              <w:pStyle w:val="Compact"/>
+            </w:pPr>
+            <w:r>
+              <w:rPr>
+                <w:b/>
+                <w:bCs/>
+              </w:rPr>
+              <w:t xml:space="preserve">Per-Asset Retry / DLQ</w:t>
             </w:r>
           </w:p>
         </w:tc>
@@ -971,7 +1669,7 @@
               <w:jc w:val="center"/>
             </w:pPr>
             <w:r>
-              <w:t xml:space="preserve">🟡 Unknown — fast if cloud-native; slow if routed through client</w:t>
+              <w:t xml:space="preserve">🔴 Not available — failure is whole-run or folder-scoped</w:t>
             </w:r>
           </w:p>
         </w:tc>
@@ -983,7 +1681,24 @@
               <w:jc w:val="center"/>
             </w:pPr>
             <w:r>
-              <w:t xml:space="preserve">🟡 Tunable via worker concurrency; bounded by API cap</w:t>
+              <w:t xml:space="preserve">✅ Native — exponential backoff + SQS DLQ per asset</w:t>
+            </w:r>
+          </w:p>
+        </w:tc>
+      </w:tr>
+      <w:tr>
+        <w:tc>
+          <w:tcPr/>
+          <w:p>
+            <w:pPr>
+              <w:pStyle w:val="Compact"/>
+            </w:pPr>
+            <w:r>
+              <w:rPr>
+                <w:b/>
+                <w:bCs/>
+              </w:rPr>
+              <w:t xml:space="preserve">Phased / Incremental Execution</w:t>
             </w:r>
           </w:p>
         </w:tc>
@@ -995,24 +1710,7 @@
               <w:jc w:val="center"/>
             </w:pPr>
             <w:r>
-              <w:t xml:space="preserve">🟢 Potentially fastest — server-side, same or nearby region</w:t>
-            </w:r>
-          </w:p>
-        </w:tc>
-      </w:tr>
-      <w:tr>
-        <w:tc>
-          <w:tcPr/>
-          <w:p>
-            <w:pPr>
-              <w:pStyle w:val="Compact"/>
-            </w:pPr>
-            <w:r>
-              <w:rPr>
-                <w:b/>
-                <w:bCs/>
-              </w:rPr>
-              <w:t xml:space="preserve">Data Egress Cost</w:t>
+              <w:t xml:space="preserve">✅ Yes — search expressions allow folder-scoped clone batches</w:t>
             </w:r>
           </w:p>
         </w:tc>
@@ -1024,7 +1722,24 @@
               <w:jc w:val="center"/>
             </w:pPr>
             <w:r>
-              <w:t xml:space="preserve">🟡 Unknown — may incur if CLI routes through client</w:t>
+              <w:t xml:space="preserve">✅ Native — enqueue any subset of assets</w:t>
+            </w:r>
+          </w:p>
+        </w:tc>
+      </w:tr>
+      <w:tr>
+        <w:tc>
+          <w:tcPr/>
+          <w:p>
+            <w:pPr>
+              <w:pStyle w:val="Compact"/>
+            </w:pPr>
+            <w:r>
+              <w:rPr>
+                <w:b/>
+                <w:bCs/>
+              </w:rPr>
+              <w:t xml:space="preserve">Async Execution</w:t>
             </w:r>
           </w:p>
         </w:tc>
@@ -1036,7 +1751,7 @@
               <w:jc w:val="center"/>
             </w:pPr>
             <w:r>
-              <w:t xml:space="preserve">🟡 Incurred — download from Cloudinary + upload to S3</w:t>
+              <w:t xml:space="preserve">✅ Yes — async flag + webhook notification on completion</w:t>
             </w:r>
           </w:p>
         </w:tc>
@@ -1048,24 +1763,24 @@
               <w:jc w:val="center"/>
             </w:pPr>
             <w:r>
-              <w:t xml:space="preserve">🟢 Potentially zero — if server-side S3 copy</w:t>
-            </w:r>
-          </w:p>
-        </w:tc>
-      </w:tr>
-      <w:tr>
-        <w:tc>
-          <w:tcPr/>
-          <w:p>
-            <w:pPr>
-              <w:pStyle w:val="Compact"/>
-            </w:pPr>
-            <w:r>
-              <w:rPr>
-                <w:b/>
-                <w:bCs/>
-              </w:rPr>
-              <w:t xml:space="preserve">Operational Visibility</w:t>
+              <w:t xml:space="preserve">✅ Native — worker fleet is inherently async</w:t>
+            </w:r>
+          </w:p>
+        </w:tc>
+      </w:tr>
+      <w:tr>
+        <w:tc>
+          <w:tcPr/>
+          <w:p>
+            <w:pPr>
+              <w:pStyle w:val="Compact"/>
+            </w:pPr>
+            <w:r>
+              <w:rPr>
+                <w:b/>
+                <w:bCs/>
+              </w:rPr>
+              <w:t xml:space="preserve">Pilot Batch (100 assets)</w:t>
             </w:r>
           </w:p>
         </w:tc>
@@ -1077,7 +1792,7 @@
               <w:jc w:val="center"/>
             </w:pPr>
             <w:r>
-              <w:t xml:space="preserve">🔴 Low — CLI is a black box</w:t>
+              <w:t xml:space="preserve">✅ Scope clone to a folder; harder to instrument per-asset</w:t>
             </w:r>
           </w:p>
         </w:tc>
@@ -1089,7 +1804,24 @@
               <w:jc w:val="center"/>
             </w:pPr>
             <w:r>
-              <w:t xml:space="preserve">✅ Full — DynamoDB state, DLQ, CloudWatch, Datadog</w:t>
+              <w:t xml:space="preserve">✅ Native — enqueue exactly 100 assets</w:t>
+            </w:r>
+          </w:p>
+        </w:tc>
+      </w:tr>
+      <w:tr>
+        <w:tc>
+          <w:tcPr/>
+          <w:p>
+            <w:pPr>
+              <w:pStyle w:val="Compact"/>
+            </w:pPr>
+            <w:r>
+              <w:rPr>
+                <w:b/>
+                <w:bCs/>
+              </w:rPr>
+              <w:t xml:space="preserve">Rollback Capability</w:t>
             </w:r>
           </w:p>
         </w:tc>
@@ -1101,24 +1833,7 @@
               <w:jc w:val="center"/>
             </w:pPr>
             <w:r>
-              <w:t xml:space="preserve">🔴 Low — opaque AWS/Cloudinary-side operation</w:t>
-            </w:r>
-          </w:p>
-        </w:tc>
-      </w:tr>
-      <w:tr>
-        <w:tc>
-          <w:tcPr/>
-          <w:p>
-            <w:pPr>
-              <w:pStyle w:val="Compact"/>
-            </w:pPr>
-            <w:r>
-              <w:rPr>
-                <w:b/>
-                <w:bCs/>
-              </w:rPr>
-              <w:t xml:space="preserve">Per-Asset Retry / DLQ</w:t>
+              <w:t xml:space="preserve">🟡 Moderate — new env isolated; partial-run state unclear without per-asset tracking</w:t>
             </w:r>
           </w:p>
         </w:tc>
@@ -1130,7 +1845,24 @@
               <w:jc w:val="center"/>
             </w:pPr>
             <w:r>
-              <w:t xml:space="preserve">🔴 Not available</w:t>
+              <w:t xml:space="preserve">✅ Strong — DynamoDB snapshot per asset; explicit rollback path</w:t>
+            </w:r>
+          </w:p>
+        </w:tc>
+      </w:tr>
+      <w:tr>
+        <w:tc>
+          <w:tcPr/>
+          <w:p>
+            <w:pPr>
+              <w:pStyle w:val="Compact"/>
+            </w:pPr>
+            <w:r>
+              <w:rPr>
+                <w:b/>
+                <w:bCs/>
+              </w:rPr>
+              <w:t xml:space="preserve">Risk to Live Environment</w:t>
             </w:r>
           </w:p>
         </w:tc>
@@ -1142,7 +1874,7 @@
               <w:jc w:val="center"/>
             </w:pPr>
             <w:r>
-              <w:t xml:space="preserve">✅ Native — exponential backoff + SQS DLQ</w:t>
+              <w:t xml:space="preserve">✅ Isolated — new Cloudinary env + UTA S3 only</w:t>
             </w:r>
           </w:p>
         </w:tc>
@@ -1154,24 +1886,24 @@
               <w:jc w:val="center"/>
             </w:pPr>
             <w:r>
-              <w:t xml:space="preserve">🔴 Not available</w:t>
-            </w:r>
-          </w:p>
-        </w:tc>
-      </w:tr>
-      <w:tr>
-        <w:tc>
-          <w:tcPr/>
-          <w:p>
-            <w:pPr>
-              <w:pStyle w:val="Compact"/>
-            </w:pPr>
-            <w:r>
-              <w:rPr>
-                <w:b/>
-                <w:bCs/>
-              </w:rPr>
-              <w:t xml:space="preserve">Rollback Capability</w:t>
+              <w:t xml:space="preserve">✅ Isolated — workers touch new env only</w:t>
+            </w:r>
+          </w:p>
+        </w:tc>
+      </w:tr>
+      <w:tr>
+        <w:tc>
+          <w:tcPr/>
+          <w:p>
+            <w:pPr>
+              <w:pStyle w:val="Compact"/>
+            </w:pPr>
+            <w:r>
+              <w:rPr>
+                <w:b/>
+                <w:bCs/>
+              </w:rPr>
+              <w:t xml:space="preserve">Engineering Effort</w:t>
             </w:r>
           </w:p>
         </w:tc>
@@ -1183,7 +1915,7 @@
               <w:jc w:val="center"/>
             </w:pPr>
             <w:r>
-              <w:t xml:space="preserve">🟡 Moderate — new env isolated; partial-run state unclear</w:t>
+              <w:t xml:space="preserve">✅ Low — primarily operational + two scripted steps</w:t>
             </w:r>
           </w:p>
         </w:tc>
@@ -1195,7 +1927,24 @@
               <w:jc w:val="center"/>
             </w:pPr>
             <w:r>
-              <w:t xml:space="preserve">✅ Strong — DynamoDB snapshot per asset; explicit rollback path</w:t>
+              <w:t xml:space="preserve">🔴 High — full infra + application build-out</w:t>
+            </w:r>
+          </w:p>
+        </w:tc>
+      </w:tr>
+      <w:tr>
+        <w:tc>
+          <w:tcPr/>
+          <w:p>
+            <w:pPr>
+              <w:pStyle w:val="Compact"/>
+            </w:pPr>
+            <w:r>
+              <w:rPr>
+                <w:b/>
+                <w:bCs/>
+              </w:rPr>
+              <w:t xml:space="preserve">AWS Infra Required</w:t>
             </w:r>
           </w:p>
         </w:tc>
@@ -1207,24 +1956,7 @@
               <w:jc w:val="center"/>
             </w:pPr>
             <w:r>
-              <w:t xml:space="preserve">🔴 Poor — reverting a cross-account copy or ownership transfer is complex</w:t>
-            </w:r>
-          </w:p>
-        </w:tc>
-      </w:tr>
-      <w:tr>
-        <w:tc>
-          <w:tcPr/>
-          <w:p>
-            <w:pPr>
-              <w:pStyle w:val="Compact"/>
-            </w:pPr>
-            <w:r>
-              <w:rPr>
-                <w:b/>
-                <w:bCs/>
-              </w:rPr>
-              <w:t xml:space="preserve">Risk to Live Environment</w:t>
+              <w:t xml:space="preserve">✅ Minimal — S3 bucket + IAM role for BYOB</w:t>
             </w:r>
           </w:p>
         </w:tc>
@@ -1236,7 +1968,24 @@
               <w:jc w:val="center"/>
             </w:pPr>
             <w:r>
-              <w:t xml:space="preserve">🟢 Isolated — new Cloudinary env only</w:t>
+              <w:t xml:space="preserve">🟡 Moderate — ECS/Batch, SQS, DynamoDB, CloudWatch</w:t>
+            </w:r>
+          </w:p>
+        </w:tc>
+      </w:tr>
+      <w:tr>
+        <w:tc>
+          <w:tcPr/>
+          <w:p>
+            <w:pPr>
+              <w:pStyle w:val="Compact"/>
+            </w:pPr>
+            <w:r>
+              <w:rPr>
+                <w:b/>
+                <w:bCs/>
+              </w:rPr>
+              <w:t xml:space="preserve">URL Continuity (CNAME)</w:t>
             </w:r>
           </w:p>
         </w:tc>
@@ -1248,7 +1997,7 @@
               <w:jc w:val="center"/>
             </w:pPr>
             <w:r>
-              <w:t xml:space="preserve">🟢 Isolated — workers touch new env only</w:t>
+              <w:t xml:space="preserve">✅ Confirmed viable</w:t>
             </w:r>
           </w:p>
         </w:tc>
@@ -1260,249 +2009,7 @@
               <w:jc w:val="center"/>
             </w:pPr>
             <w:r>
-              <w:t xml:space="preserve">🔴 Potentially high — depends on AWS/Cloudinary infra boundaries</w:t>
-            </w:r>
-          </w:p>
-        </w:tc>
-      </w:tr>
-      <w:tr>
-        <w:tc>
-          <w:tcPr/>
-          <w:p>
-            <w:pPr>
-              <w:pStyle w:val="Compact"/>
-            </w:pPr>
-            <w:r>
-              <w:rPr>
-                <w:b/>
-                <w:bCs/>
-              </w:rPr>
-              <w:t xml:space="preserve">Pilot Batch Support (100 assets)</w:t>
-            </w:r>
-          </w:p>
-        </w:tc>
-        <w:tc>
-          <w:tcPr/>
-          <w:p>
-            <w:pPr>
-              <w:pStyle w:val="Compact"/>
-              <w:jc w:val="center"/>
-            </w:pPr>
-            <w:r>
-              <w:t xml:space="preserve">🟡 Can scope to a folder; hard to instrument</w:t>
-            </w:r>
-          </w:p>
-        </w:tc>
-        <w:tc>
-          <w:tcPr/>
-          <w:p>
-            <w:pPr>
-              <w:pStyle w:val="Compact"/>
-              <w:jc w:val="center"/>
-            </w:pPr>
-            <w:r>
-              <w:t xml:space="preserve">✅ Native — first-class feature in queue/worker model</w:t>
-            </w:r>
-          </w:p>
-        </w:tc>
-        <w:tc>
-          <w:tcPr/>
-          <w:p>
-            <w:pPr>
-              <w:pStyle w:val="Compact"/>
-              <w:jc w:val="center"/>
-            </w:pPr>
-            <w:r>
-              <w:t xml:space="preserve">🔴 Hard to pilot — likely all-or-nothing at bucket level</w:t>
-            </w:r>
-          </w:p>
-        </w:tc>
-      </w:tr>
-      <w:tr>
-        <w:tc>
-          <w:tcPr/>
-          <w:p>
-            <w:pPr>
-              <w:pStyle w:val="Compact"/>
-            </w:pPr>
-            <w:r>
-              <w:rPr>
-                <w:b/>
-                <w:bCs/>
-              </w:rPr>
-              <w:t xml:space="preserve">URL Continuity (CNAME)</w:t>
-            </w:r>
-          </w:p>
-        </w:tc>
-        <w:tc>
-          <w:tcPr/>
-          <w:p>
-            <w:pPr>
-              <w:pStyle w:val="Compact"/>
-              <w:jc w:val="center"/>
-            </w:pPr>
-            <w:r>
-              <w:t xml:space="preserve">✅ CNAME swap confirmed viable in Q&amp;A 2</w:t>
-            </w:r>
-          </w:p>
-        </w:tc>
-        <w:tc>
-          <w:tcPr/>
-          <w:p>
-            <w:pPr>
-              <w:pStyle w:val="Compact"/>
-              <w:jc w:val="center"/>
-            </w:pPr>
-            <w:r>
-              <w:t xml:space="preserve">✅ Same — new env + same</w:t>
-            </w:r>
-            <w:r>
-              <w:t xml:space="preserve"> </w:t>
-            </w:r>
-            <w:r>
-              <w:rPr>
-                <w:rStyle w:val="VerbatimChar"/>
-              </w:rPr>
-              <w:t xml:space="preserve">public_id</w:t>
-            </w:r>
-            <w:r>
-              <w:t xml:space="preserve"> </w:t>
-            </w:r>
-            <w:r>
-              <w:t xml:space="preserve">+ CNAME swap</w:t>
-            </w:r>
-          </w:p>
-        </w:tc>
-        <w:tc>
-          <w:tcPr/>
-          <w:p>
-            <w:pPr>
-              <w:pStyle w:val="Compact"/>
-              <w:jc w:val="center"/>
-            </w:pPr>
-            <w:r>
-              <w:t xml:space="preserve">🟡 Viable only if</w:t>
-            </w:r>
-            <w:r>
-              <w:t xml:space="preserve"> </w:t>
-            </w:r>
-            <w:r>
-              <w:rPr>
-                <w:rStyle w:val="VerbatimChar"/>
-              </w:rPr>
-              <w:t xml:space="preserve">public_id</w:t>
-            </w:r>
-            <w:r>
-              <w:t xml:space="preserve"> </w:t>
-            </w:r>
-            <w:r>
-              <w:t xml:space="preserve">reconciliation succeeds</w:t>
-            </w:r>
-          </w:p>
-        </w:tc>
-      </w:tr>
-      <w:tr>
-        <w:tc>
-          <w:tcPr/>
-          <w:p>
-            <w:pPr>
-              <w:pStyle w:val="Compact"/>
-            </w:pPr>
-            <w:r>
-              <w:rPr>
-                <w:b/>
-                <w:bCs/>
-              </w:rPr>
-              <w:t xml:space="preserve">Implementation Effort</w:t>
-            </w:r>
-          </w:p>
-        </w:tc>
-        <w:tc>
-          <w:tcPr/>
-          <w:p>
-            <w:pPr>
-              <w:pStyle w:val="Compact"/>
-              <w:jc w:val="center"/>
-            </w:pPr>
-            <w:r>
-              <w:t xml:space="preserve">🟢 Low (if CLI behaves as hoped)</w:t>
-            </w:r>
-          </w:p>
-        </w:tc>
-        <w:tc>
-          <w:tcPr/>
-          <w:p>
-            <w:pPr>
-              <w:pStyle w:val="Compact"/>
-              <w:jc w:val="center"/>
-            </w:pPr>
-            <w:r>
-              <w:t xml:space="preserve">🔴 High — full controller + worker + infra build-out</w:t>
-            </w:r>
-          </w:p>
-        </w:tc>
-        <w:tc>
-          <w:tcPr/>
-          <w:p>
-            <w:pPr>
-              <w:pStyle w:val="Compact"/>
-              <w:jc w:val="center"/>
-            </w:pPr>
-            <w:r>
-              <w:t xml:space="preserve">🟢 Low (if supported) — primarily administrative</w:t>
-            </w:r>
-          </w:p>
-        </w:tc>
-      </w:tr>
-      <w:tr>
-        <w:tc>
-          <w:tcPr/>
-          <w:p>
-            <w:pPr>
-              <w:pStyle w:val="Compact"/>
-            </w:pPr>
-            <w:r>
-              <w:rPr>
-                <w:b/>
-                <w:bCs/>
-              </w:rPr>
-              <w:t xml:space="preserve">AWS + Infra Work Required</w:t>
-            </w:r>
-          </w:p>
-        </w:tc>
-        <w:tc>
-          <w:tcPr/>
-          <w:p>
-            <w:pPr>
-              <w:pStyle w:val="Compact"/>
-              <w:jc w:val="center"/>
-            </w:pPr>
-            <w:r>
-              <w:t xml:space="preserve">🟢 Minimal (S3 bucket + BYOB setup)</w:t>
-            </w:r>
-          </w:p>
-        </w:tc>
-        <w:tc>
-          <w:tcPr/>
-          <w:p>
-            <w:pPr>
-              <w:pStyle w:val="Compact"/>
-              <w:jc w:val="center"/>
-            </w:pPr>
-            <w:r>
-              <w:t xml:space="preserve">🟡 Moderate — ECS/Batch, SQS, DynamoDB, CloudWatch</w:t>
-            </w:r>
-          </w:p>
-        </w:tc>
-        <w:tc>
-          <w:tcPr/>
-          <w:p>
-            <w:pPr>
-              <w:pStyle w:val="Compact"/>
-              <w:jc w:val="center"/>
-            </w:pPr>
-            <w:r>
-              <w:t xml:space="preserve">🟢 Minimal — S3 bucket + cross-account policy</w:t>
+              <w:t xml:space="preserve">✅ Confirmed viable</w:t>
             </w:r>
           </w:p>
         </w:tc>
@@ -1533,8 +2040,8 @@
         </w:pict>
       </w:r>
     </w:p>
-    <w:bookmarkEnd w:id="17"/>
-    <w:bookmarkStart w:id="18" w:name="Xeacf35092b74de808fcb0bc3cf1082c11a4cc00"/>
+    <w:bookmarkEnd w:id="15"/>
+    <w:bookmarkStart w:id="16" w:name="Xeacf35092b74de808fcb0bc3cf1082c11a4cc00"/>
     <w:p>
       <w:pPr>
         <w:pStyle w:val="Heading2"/>
@@ -1605,7 +2112,136 @@
                 <w:b/>
                 <w:bCs/>
               </w:rPr>
-              <w:t xml:space="preserve">Reliability</w:t>
+              <w:t xml:space="preserve">Lowest Engineering Effort</w:t>
+            </w:r>
+          </w:p>
+        </w:tc>
+        <w:tc>
+          <w:tcPr/>
+          <w:p>
+            <w:pPr>
+              <w:pStyle w:val="Compact"/>
+            </w:pPr>
+            <w:r>
+              <w:rPr>
+                <w:b/>
+                <w:bCs/>
+              </w:rPr>
+              <w:t xml:space="preserve">A</w:t>
+            </w:r>
+          </w:p>
+        </w:tc>
+        <w:tc>
+          <w:tcPr/>
+          <w:p>
+            <w:pPr>
+              <w:pStyle w:val="Compact"/>
+            </w:pPr>
+            <w:r>
+              <w:t xml:space="preserve">Server-side clone + two scripted steps; no infra build-out required</w:t>
+            </w:r>
+          </w:p>
+        </w:tc>
+      </w:tr>
+      <w:tr>
+        <w:tc>
+          <w:tcPr/>
+          <w:p>
+            <w:pPr>
+              <w:pStyle w:val="Compact"/>
+            </w:pPr>
+            <w:r>
+              <w:rPr>
+                <w:b/>
+                <w:bCs/>
+              </w:rPr>
+              <w:t xml:space="preserve">Lowest Data Transfer Cost</w:t>
+            </w:r>
+          </w:p>
+        </w:tc>
+        <w:tc>
+          <w:tcPr/>
+          <w:p>
+            <w:pPr>
+              <w:pStyle w:val="Compact"/>
+            </w:pPr>
+            <w:r>
+              <w:rPr>
+                <w:b/>
+                <w:bCs/>
+              </w:rPr>
+              <w:t xml:space="preserve">A</w:t>
+            </w:r>
+          </w:p>
+        </w:tc>
+        <w:tc>
+          <w:tcPr/>
+          <w:p>
+            <w:pPr>
+              <w:pStyle w:val="Compact"/>
+            </w:pPr>
+            <w:r>
+              <w:t xml:space="preserve">Server-side copy = zero egress; Option B incurs download + upload bandwidth for ~3 TB</w:t>
+            </w:r>
+          </w:p>
+        </w:tc>
+      </w:tr>
+      <w:tr>
+        <w:tc>
+          <w:tcPr/>
+          <w:p>
+            <w:pPr>
+              <w:pStyle w:val="Compact"/>
+            </w:pPr>
+            <w:r>
+              <w:rPr>
+                <w:b/>
+                <w:bCs/>
+              </w:rPr>
+              <w:t xml:space="preserve">Fastest Transfer</w:t>
+            </w:r>
+          </w:p>
+        </w:tc>
+        <w:tc>
+          <w:tcPr/>
+          <w:p>
+            <w:pPr>
+              <w:pStyle w:val="Compact"/>
+            </w:pPr>
+            <w:r>
+              <w:rPr>
+                <w:b/>
+                <w:bCs/>
+              </w:rPr>
+              <w:t xml:space="preserve">A</w:t>
+            </w:r>
+          </w:p>
+        </w:tc>
+        <w:tc>
+          <w:tcPr/>
+          <w:p>
+            <w:pPr>
+              <w:pStyle w:val="Compact"/>
+            </w:pPr>
+            <w:r>
+              <w:t xml:space="preserve">No client bandwidth constraint; Cloudinary handles transfer natively</w:t>
+            </w:r>
+          </w:p>
+        </w:tc>
+      </w:tr>
+      <w:tr>
+        <w:tc>
+          <w:tcPr/>
+          <w:p>
+            <w:pPr>
+              <w:pStyle w:val="Compact"/>
+            </w:pPr>
+            <w:r>
+              <w:rPr>
+                <w:b/>
+                <w:bCs/>
+              </w:rPr>
+              <w:t xml:space="preserve">Reliability / Per-Asset Retry</w:t>
             </w:r>
           </w:p>
         </w:tc>
@@ -1631,7 +2267,7 @@
               <w:pStyle w:val="Compact"/>
             </w:pPr>
             <w:r>
-              <w:t xml:space="preserve">Full idempotency, per-asset DLQ, retry with backoff — designed for 3 TB at scale</w:t>
+              <w:t xml:space="preserve">DLQ + backoff designed for partial failures at 3 TB scale</w:t>
             </w:r>
           </w:p>
         </w:tc>
@@ -1674,7 +2310,7 @@
               <w:pStyle w:val="Compact"/>
             </w:pPr>
             <w:r>
-              <w:t xml:space="preserve">Only option with per-asset state tracking, metrics pipeline, and alerting</w:t>
+              <w:t xml:space="preserve">Only option with per-asset state, dashboards, and alerting</w:t>
             </w:r>
           </w:p>
         </w:tc>
@@ -1717,186 +2353,7 @@
               <w:pStyle w:val="Compact"/>
             </w:pPr>
             <w:r>
-              <w:t xml:space="preserve">DynamoDB snapshots + isolated new environment = safest rollback story</w:t>
-            </w:r>
-          </w:p>
-        </w:tc>
-      </w:tr>
-      <w:tr>
-        <w:tc>
-          <w:tcPr/>
-          <w:p>
-            <w:pPr>
-              <w:pStyle w:val="Compact"/>
-            </w:pPr>
-            <w:r>
-              <w:rPr>
-                <w:b/>
-                <w:bCs/>
-              </w:rPr>
-              <w:t xml:space="preserve">Lowest Engineering Effort</w:t>
-            </w:r>
-          </w:p>
-        </w:tc>
-        <w:tc>
-          <w:tcPr/>
-          <w:p>
-            <w:pPr>
-              <w:pStyle w:val="Compact"/>
-            </w:pPr>
-            <w:r>
-              <w:rPr>
-                <w:b/>
-                <w:bCs/>
-              </w:rPr>
-              <w:t xml:space="preserve">A</w:t>
-            </w:r>
-            <w:r>
-              <w:t xml:space="preserve"> </w:t>
-            </w:r>
-            <w:r>
-              <w:t xml:space="preserve">(if CLI works) /</w:t>
-            </w:r>
-            <w:r>
-              <w:t xml:space="preserve"> </w:t>
-            </w:r>
-            <w:r>
-              <w:rPr>
-                <w:b/>
-                <w:bCs/>
-              </w:rPr>
-              <w:t xml:space="preserve">C</w:t>
-            </w:r>
-            <w:r>
-              <w:t xml:space="preserve"> </w:t>
-            </w:r>
-            <w:r>
-              <w:t xml:space="preserve">(if AWS supports it)</w:t>
-            </w:r>
-          </w:p>
-        </w:tc>
-        <w:tc>
-          <w:tcPr/>
-          <w:p>
-            <w:pPr>
-              <w:pStyle w:val="Compact"/>
-            </w:pPr>
-            <w:r>
-              <w:t xml:space="preserve">One command or one administrative operation</w:t>
-            </w:r>
-          </w:p>
-        </w:tc>
-      </w:tr>
-      <w:tr>
-        <w:tc>
-          <w:tcPr/>
-          <w:p>
-            <w:pPr>
-              <w:pStyle w:val="Compact"/>
-            </w:pPr>
-            <w:r>
-              <w:rPr>
-                <w:b/>
-                <w:bCs/>
-              </w:rPr>
-              <w:t xml:space="preserve">Lowest Data Transfer Cost</w:t>
-            </w:r>
-          </w:p>
-        </w:tc>
-        <w:tc>
-          <w:tcPr/>
-          <w:p>
-            <w:pPr>
-              <w:pStyle w:val="Compact"/>
-            </w:pPr>
-            <w:r>
-              <w:rPr>
-                <w:b/>
-                <w:bCs/>
-              </w:rPr>
-              <w:t xml:space="preserve">C</w:t>
-            </w:r>
-            <w:r>
-              <w:t xml:space="preserve"> </w:t>
-            </w:r>
-            <w:r>
-              <w:t xml:space="preserve">(if feasible)</w:t>
-            </w:r>
-          </w:p>
-        </w:tc>
-        <w:tc>
-          <w:tcPr/>
-          <w:p>
-            <w:pPr>
-              <w:pStyle w:val="Compact"/>
-            </w:pPr>
-            <w:r>
-              <w:t xml:space="preserve">Server-side copy = zero egress</w:t>
-            </w:r>
-          </w:p>
-        </w:tc>
-      </w:tr>
-      <w:tr>
-        <w:tc>
-          <w:tcPr/>
-          <w:p>
-            <w:pPr>
-              <w:pStyle w:val="Compact"/>
-            </w:pPr>
-            <w:r>
-              <w:rPr>
-                <w:b/>
-                <w:bCs/>
-              </w:rPr>
-              <w:t xml:space="preserve">Fastest Transfer</w:t>
-            </w:r>
-          </w:p>
-        </w:tc>
-        <w:tc>
-          <w:tcPr/>
-          <w:p>
-            <w:pPr>
-              <w:pStyle w:val="Compact"/>
-            </w:pPr>
-            <w:r>
-              <w:rPr>
-                <w:b/>
-                <w:bCs/>
-              </w:rPr>
-              <w:t xml:space="preserve">C</w:t>
-            </w:r>
-            <w:r>
-              <w:t xml:space="preserve"> </w:t>
-            </w:r>
-            <w:r>
-              <w:t xml:space="preserve">(if feasible)</w:t>
-            </w:r>
-          </w:p>
-        </w:tc>
-        <w:tc>
-          <w:tcPr/>
-          <w:p>
-            <w:pPr>
-              <w:pStyle w:val="Compact"/>
-            </w:pPr>
-            <w:r>
-              <w:t xml:space="preserve">No client-side bandwidth; otherwise</w:t>
-            </w:r>
-            <w:r>
-              <w:t xml:space="preserve"> </w:t>
-            </w:r>
-            <w:r>
-              <w:rPr>
-                <w:b/>
-                <w:bCs/>
-              </w:rPr>
-              <w:t xml:space="preserve">A</w:t>
-            </w:r>
-            <w:r>
-              <w:t xml:space="preserve"> </w:t>
-            </w:r>
-            <w:r>
-              <w:t xml:space="preserve">if CLI is cloud-native</w:t>
+              <w:t xml:space="preserve">DynamoDB snapshots + isolated environment = safest rollback story</w:t>
             </w:r>
           </w:p>
         </w:tc>
@@ -1939,24 +2396,24 @@
               <w:pStyle w:val="Compact"/>
             </w:pPr>
             <w:r>
-              <w:t xml:space="preserve">PS scope is well-defined (BYOB setup); migration is entirely self-directed</w:t>
-            </w:r>
-          </w:p>
-        </w:tc>
-      </w:tr>
-      <w:tr>
-        <w:tc>
-          <w:tcPr/>
-          <w:p>
-            <w:pPr>
-              <w:pStyle w:val="Compact"/>
-            </w:pPr>
-            <w:r>
-              <w:rPr>
-                <w:b/>
-                <w:bCs/>
-              </w:rPr>
-              <w:t xml:space="preserve">Lowest Risk Overall</w:t>
+              <w:t xml:space="preserve">PS scope well-defined; migration engine is entirely self-directed after BYOB setup</w:t>
+            </w:r>
+          </w:p>
+        </w:tc>
+      </w:tr>
+      <w:tr>
+        <w:tc>
+          <w:tcPr/>
+          <w:p>
+            <w:pPr>
+              <w:pStyle w:val="Compact"/>
+            </w:pPr>
+            <w:r>
+              <w:rPr>
+                <w:b/>
+                <w:bCs/>
+              </w:rPr>
+              <w:t xml:space="preserve">Structured Metadata Control</w:t>
             </w:r>
           </w:p>
         </w:tc>
@@ -1982,7 +2439,7 @@
               <w:pStyle w:val="Compact"/>
             </w:pPr>
             <w:r>
-              <w:t xml:space="preserve">All quality attributes are understood; no external blockers</w:t>
+              <w:t xml:space="preserve">Explicit per-asset write during migration — no separate taxonomy step required</w:t>
             </w:r>
           </w:p>
         </w:tc>
@@ -1995,7 +2452,7 @@
         </w:pict>
       </w:r>
     </w:p>
-    <w:bookmarkEnd w:id="18"/>
+    <w:bookmarkEnd w:id="16"/>
     <w:bookmarkStart w:id="19" w:name="recommendation"/>
     <w:p>
       <w:pPr>
@@ -2005,52 +2462,99 @@
         <w:t xml:space="preserve">Recommendation</w:t>
       </w:r>
     </w:p>
+    <w:bookmarkStart w:id="17" w:name="X39d0f4a52a3d40520837077d5d2504a2d4ffc86"/>
+    <w:p>
+      <w:pPr>
+        <w:pStyle w:val="Heading3"/>
+      </w:pPr>
+      <w:r>
+        <w:t xml:space="preserve">Preferred Path: Option A (</w:t>
+      </w:r>
+      <w:r>
+        <w:rPr>
+          <w:rStyle w:val="VerbatimChar"/>
+        </w:rPr>
+        <w:t xml:space="preserve">cld clone</w:t>
+      </w:r>
+      <w:r>
+        <w:t xml:space="preserve">) — with Option B as Fallback</w:t>
+      </w:r>
+    </w:p>
     <w:p>
       <w:pPr>
         <w:pStyle w:val="FirstParagraph"/>
+      </w:pPr>
+      <w:r>
+        <w:t xml:space="preserve">Q&amp;A 3 removed the critical blocker for Option A.</w:t>
+      </w:r>
+      <w:r>
+        <w:t xml:space="preserve"> </w:t>
+      </w:r>
+      <w:r>
+        <w:rPr>
+          <w:rStyle w:val="VerbatimChar"/>
+        </w:rPr>
+        <w:t xml:space="preserve">cld clone</w:t>
+      </w:r>
+      <w:r>
+        <w:t xml:space="preserve"> </w:t>
+      </w:r>
+      <w:r>
+        <w:t xml:space="preserve">is now confirmed to perform a server-side binary + metadata copy, preserving</w:t>
+      </w:r>
+      <w:r>
+        <w:t xml:space="preserve"> </w:t>
+      </w:r>
+      <w:r>
+        <w:rPr>
+          <w:rStyle w:val="VerbatimChar"/>
+        </w:rPr>
+        <w:t xml:space="preserve">public_id</w:t>
+      </w:r>
+      <w:r>
+        <w:t xml:space="preserve">, tags, and context fields — the majority of UTA’s metadata surface area. The structured metadata taxonomy gap is real but manageable: it requires a scripted export/re-import step, not a fundamental re-architecture.</w:t>
+      </w:r>
+    </w:p>
+    <w:p>
+      <w:pPr>
+        <w:pStyle w:val="BodyText"/>
       </w:pPr>
       <w:r>
         <w:rPr>
           <w:b/>
           <w:bCs/>
         </w:rPr>
-        <w:t xml:space="preserve">Option B (Worker Fleet) is the recommended baseline</w:t>
-      </w:r>
-      <w:r>
-        <w:t xml:space="preserve"> </w:t>
-      </w:r>
-      <w:r>
-        <w:t xml:space="preserve">and the fallback of last resort. It is the only option where:</w:t>
-      </w:r>
-      <w:r>
-        <w:t xml:space="preserve"> </w:t>
-      </w:r>
-      <w:r>
-        <w:t xml:space="preserve">- All quality attributes are fully understood before work starts.</w:t>
-      </w:r>
-      <w:r>
-        <w:t xml:space="preserve"> </w:t>
-      </w:r>
-      <w:r>
-        <w:t xml:space="preserve">- The 5,000 req/hr Admin API rate limit is respected by design.</w:t>
-      </w:r>
-      <w:r>
-        <w:t xml:space="preserve"> </w:t>
-      </w:r>
-      <w:r>
-        <w:t xml:space="preserve">- UTA retains full operational control and observability.</w:t>
-      </w:r>
-      <w:r>
-        <w:t xml:space="preserve"> </w:t>
-      </w:r>
-      <w:r>
-        <w:t xml:space="preserve">- A pilot batch (100 assets) validates the approach before full-scale execution.</w:t>
-      </w:r>
-      <w:r>
-        <w:t xml:space="preserve"> </w:t>
-      </w:r>
-      <w:r>
-        <w:t xml:space="preserve">- Rollback is explicit and reversible at the per-asset level.</w:t>
+        <w:t xml:space="preserve">Option A is preferred because:</w:t>
+      </w:r>
+      <w:r>
+        <w:t xml:space="preserve"> </w:t>
+      </w:r>
+      <w:r>
+        <w:t xml:space="preserve">- Zero data egress cost vs. downloading and re-uploading ~3 TB through an intermediary.</w:t>
+      </w:r>
+      <w:r>
+        <w:t xml:space="preserve"> </w:t>
+      </w:r>
+      <w:r>
+        <w:t xml:space="preserve">- Dramatically lower engineering effort — no SQS/DynamoDB/ECS build-out required.</w:t>
+      </w:r>
+      <w:r>
+        <w:t xml:space="preserve"> </w:t>
+      </w:r>
+      <w:r>
+        <w:t xml:space="preserve">- Cloudinary handles the binary transfer natively; delivery team effort is scoped to structured metadata scripting and env config replication.</w:t>
+      </w:r>
+      <w:r>
+        <w:t xml:space="preserve"> </w:t>
+      </w:r>
+      <w:r>
+        <w:t xml:space="preserve">- Phased execution via search expressions provides the same incremental validation story as Option B.</w:t>
+      </w:r>
+      <w:r>
+        <w:t xml:space="preserve"> </w:t>
+      </w:r>
+      <w:r>
+        <w:t xml:space="preserve">- Async mode + webhooks give sufficient operational awareness for a PS-supervised operation.</w:t>
       </w:r>
     </w:p>
     <w:p>
@@ -2062,13 +2566,13 @@
           <w:b/>
           <w:bCs/>
         </w:rPr>
-        <w:t xml:space="preserve">Option A (CLI) is the highest-ROI clarification item for the Cloudinary PS workshop.</w:t>
-      </w:r>
-      <w:r>
-        <w:t xml:space="preserve"> </w:t>
-      </w:r>
-      <w:r>
-        <w:t xml:space="preserve">If</w:t>
+        <w:t xml:space="preserve">Option A’s residual risks that must be resolved in the PS scoping session:</w:t>
+      </w:r>
+      <w:r>
+        <w:t xml:space="preserve"> </w:t>
+      </w:r>
+      <w:r>
+        <w:t xml:space="preserve">1. Admin API rate consumption inside</w:t>
       </w:r>
       <w:r>
         <w:t xml:space="preserve"> </w:t>
@@ -2083,7 +2587,25 @@
         <w:t xml:space="preserve"> </w:t>
       </w:r>
       <w:r>
-        <w:t xml:space="preserve">replicates metadata and binary assets into a BYOB-backed new environment in a single operation, the engineering effort drops significantly and Option A becomes the preferred path.</w:t>
+        <w:t xml:space="preserve">at ~3 TB scale — unknown and potentially throttling.</w:t>
+      </w:r>
+      <w:r>
+        <w:t xml:space="preserve"> </w:t>
+      </w:r>
+      <w:r>
+        <w:t xml:space="preserve">2. S3 key naming convention under BYOB — UTA control is unknown; affects IAM scoping and bucket organization.</w:t>
+      </w:r>
+      <w:r>
+        <w:t xml:space="preserve"> </w:t>
+      </w:r>
+      <w:r>
+        <w:t xml:space="preserve">3. Behavior of delivery requests during the empty-bucket window of a rolling clone — fallback to old env? 404?</w:t>
+      </w:r>
+      <w:r>
+        <w:t xml:space="preserve"> </w:t>
+      </w:r>
+      <w:r>
+        <w:t xml:space="preserve">4. Whether async + webhook gives sufficient failure visibility at this scale, or whether a thin wrapper script is needed.</w:t>
       </w:r>
     </w:p>
     <w:p>
@@ -2095,13 +2617,61 @@
           <w:b/>
           <w:bCs/>
         </w:rPr>
-        <w:t xml:space="preserve">Option C is worth raising but treat as low-probability.</w:t>
-      </w:r>
-      <w:r>
-        <w:t xml:space="preserve"> </w:t>
-      </w:r>
-      <w:r>
-        <w:t xml:space="preserve">Sub-variant C2 (cross-account S3 copy via Cloudinary-configured bucket policy) is the only technically plausible form. Sub-variant C1 (AWS tenant ownership transfer) is not a supported AWS primitive.</w:t>
+        <w:t xml:space="preserve">Option B remains the fallback of last resort.</w:t>
+      </w:r>
+      <w:r>
+        <w:t xml:space="preserve"> </w:t>
+      </w:r>
+      <w:r>
+        <w:t xml:space="preserve">If PS scoping reveals that</w:t>
+      </w:r>
+      <w:r>
+        <w:t xml:space="preserve"> </w:t>
+      </w:r>
+      <w:r>
+        <w:rPr>
+          <w:rStyle w:val="VerbatimChar"/>
+        </w:rPr>
+        <w:t xml:space="preserve">cld clone</w:t>
+      </w:r>
+      <w:r>
+        <w:t xml:space="preserve"> </w:t>
+      </w:r>
+      <w:r>
+        <w:t xml:space="preserve">has unacceptable rate-limit behavior, insufficient error reporting, or cannot be reliably validated at 3 TB, the Worker Fleet provides full programmatic control at the cost of higher engineering effort and egress fees.</w:t>
+      </w:r>
+    </w:p>
+    <w:bookmarkEnd w:id="17"/>
+    <w:bookmarkStart w:id="18" w:name="hybrid-consideration"/>
+    <w:p>
+      <w:pPr>
+        <w:pStyle w:val="Heading3"/>
+      </w:pPr>
+      <w:r>
+        <w:t xml:space="preserve">Hybrid Consideration</w:t>
+      </w:r>
+    </w:p>
+    <w:p>
+      <w:pPr>
+        <w:pStyle w:val="FirstParagraph"/>
+      </w:pPr>
+      <w:r>
+        <w:t xml:space="preserve">A lightweight hybrid is worth evaluating: use</w:t>
+      </w:r>
+      <w:r>
+        <w:t xml:space="preserve"> </w:t>
+      </w:r>
+      <w:r>
+        <w:rPr>
+          <w:rStyle w:val="VerbatimChar"/>
+        </w:rPr>
+        <w:t xml:space="preserve">cld clone</w:t>
+      </w:r>
+      <w:r>
+        <w:t xml:space="preserve"> </w:t>
+      </w:r>
+      <w:r>
+        <w:t xml:space="preserve">for binary + primary metadata transfer, and pair it with a thin monitoring wrapper (Lambda + DynamoDB) that tracks which folder-scoped clone batches have completed and validates asset counts against the source environment. This captures most of Option A’s cost and speed benefits while adding enough observability to reduce operational risk — without building a full SQS/ECS pipeline.</w:t>
       </w:r>
     </w:p>
     <w:p>
@@ -2111,22 +2681,15 @@
         </w:pict>
       </w:r>
     </w:p>
+    <w:bookmarkEnd w:id="18"/>
     <w:bookmarkEnd w:id="19"/>
-    <w:bookmarkStart w:id="20" w:name="Xd5c2e673b5957ed6cfe44a47cf708835c9def03"/>
+    <w:bookmarkStart w:id="20" w:name="X5ef89e1c80259dde5c696a8cb726196f1c1116a"/>
     <w:p>
       <w:pPr>
         <w:pStyle w:val="Heading2"/>
       </w:pPr>
       <w:r>
-        <w:t xml:space="preserve">Open Questions for Cloudinary Professional Services Workshop</w:t>
-      </w:r>
-    </w:p>
-    <w:p>
-      <w:pPr>
-        <w:pStyle w:val="FirstParagraph"/>
-      </w:pPr>
-      <w:r>
-        <w:t xml:space="preserve">The following questions must be resolved before selecting a migration path. These are the primary agenda items for the PS engagement session.</w:t>
+        <w:t xml:space="preserve">Remaining Open Questions for PS Scoping Session</w:t>
       </w:r>
     </w:p>
     <w:tbl>
@@ -2210,7 +2773,7 @@
               <w:pStyle w:val="Compact"/>
             </w:pPr>
             <w:r>
-              <w:t xml:space="preserve">Does</w:t>
+              <w:t xml:space="preserve">What Admin API request rate does</w:t>
             </w:r>
             <w:r>
               <w:t xml:space="preserve"> </w:t>
@@ -2225,7 +2788,145 @@
               <w:t xml:space="preserve"> </w:t>
             </w:r>
             <w:r>
-              <w:t xml:space="preserve">copy binary assets, metadata (tags, context, structured fields), and</w:t>
+              <w:t xml:space="preserve">consume internally per asset at scale? Does it approach or exceed 5,000 req/hr?</w:t>
+            </w:r>
+          </w:p>
+        </w:tc>
+        <w:tc>
+          <w:tcPr/>
+          <w:p>
+            <w:pPr>
+              <w:pStyle w:val="Compact"/>
+            </w:pPr>
+            <w:r>
+              <w:t xml:space="preserve">A</w:t>
+            </w:r>
+          </w:p>
+        </w:tc>
+        <w:tc>
+          <w:tcPr/>
+          <w:p>
+            <w:pPr>
+              <w:pStyle w:val="Compact"/>
+            </w:pPr>
+            <w:r>
+              <w:t xml:space="preserve">May throttle mid-migration; could force Option B</w:t>
+            </w:r>
+          </w:p>
+        </w:tc>
+      </w:tr>
+      <w:tr>
+        <w:tc>
+          <w:tcPr/>
+          <w:p>
+            <w:pPr>
+              <w:pStyle w:val="Compact"/>
+            </w:pPr>
+            <w:r>
+              <w:t xml:space="preserve">2</w:t>
+            </w:r>
+          </w:p>
+        </w:tc>
+        <w:tc>
+          <w:tcPr/>
+          <w:p>
+            <w:pPr>
+              <w:pStyle w:val="Compact"/>
+            </w:pPr>
+            <w:r>
+              <w:t xml:space="preserve">What is the S3 key/path structure Cloudinary writes under BYOB? Is it stable and documented?</w:t>
+            </w:r>
+          </w:p>
+        </w:tc>
+        <w:tc>
+          <w:tcPr/>
+          <w:p>
+            <w:pPr>
+              <w:pStyle w:val="Compact"/>
+            </w:pPr>
+            <w:r>
+              <w:t xml:space="preserve">A + B</w:t>
+            </w:r>
+          </w:p>
+        </w:tc>
+        <w:tc>
+          <w:tcPr/>
+          <w:p>
+            <w:pPr>
+              <w:pStyle w:val="Compact"/>
+            </w:pPr>
+            <w:r>
+              <w:t xml:space="preserve">Required for IAM scoping, bucket organization, and any post-migration S3 tooling</w:t>
+            </w:r>
+          </w:p>
+        </w:tc>
+      </w:tr>
+      <w:tr>
+        <w:tc>
+          <w:tcPr/>
+          <w:p>
+            <w:pPr>
+              <w:pStyle w:val="Compact"/>
+            </w:pPr>
+            <w:r>
+              <w:t xml:space="preserve">3</w:t>
+            </w:r>
+          </w:p>
+        </w:tc>
+        <w:tc>
+          <w:tcPr/>
+          <w:p>
+            <w:pPr>
+              <w:pStyle w:val="Compact"/>
+            </w:pPr>
+            <w:r>
+              <w:t xml:space="preserve">Does UTA have any control over the S3 key naming convention under BYOB?</w:t>
+            </w:r>
+          </w:p>
+        </w:tc>
+        <w:tc>
+          <w:tcPr/>
+          <w:p>
+            <w:pPr>
+              <w:pStyle w:val="Compact"/>
+            </w:pPr>
+            <w:r>
+              <w:t xml:space="preserve">A + B</w:t>
+            </w:r>
+          </w:p>
+        </w:tc>
+        <w:tc>
+          <w:tcPr/>
+          <w:p>
+            <w:pPr>
+              <w:pStyle w:val="Compact"/>
+            </w:pPr>
+            <w:r>
+              <w:t xml:space="preserve">Affects long-term S3 organization strategy</w:t>
+            </w:r>
+          </w:p>
+        </w:tc>
+      </w:tr>
+      <w:tr>
+        <w:tc>
+          <w:tcPr/>
+          <w:p>
+            <w:pPr>
+              <w:pStyle w:val="Compact"/>
+            </w:pPr>
+            <w:r>
+              <w:t xml:space="preserve">4</w:t>
+            </w:r>
+          </w:p>
+        </w:tc>
+        <w:tc>
+          <w:tcPr/>
+          <w:p>
+            <w:pPr>
+              <w:pStyle w:val="Compact"/>
+            </w:pPr>
+            <w:r>
+              <w:t xml:space="preserve">How does</w:t>
             </w:r>
             <w:r>
               <w:t xml:space="preserve"> </w:t>
@@ -2234,13 +2935,13 @@
               <w:rPr>
                 <w:rStyle w:val="VerbatimChar"/>
               </w:rPr>
-              <w:t xml:space="preserve">public_id</w:t>
+              <w:t xml:space="preserve">cld clone</w:t>
             </w:r>
             <w:r>
               <w:t xml:space="preserve"> </w:t>
             </w:r>
             <w:r>
-              <w:t xml:space="preserve">exactly as-is into a new environment?</w:t>
+              <w:t xml:space="preserve">report per-folder or per-asset failures in async mode? Is there a log or API to inspect partial failures?</w:t>
             </w:r>
           </w:p>
         </w:tc>
@@ -2262,46 +2963,31 @@
               <w:pStyle w:val="Compact"/>
             </w:pPr>
             <w:r>
-              <w:t xml:space="preserve">Cannot assess Option A feasibility</w:t>
-            </w:r>
-          </w:p>
-        </w:tc>
-      </w:tr>
-      <w:tr>
-        <w:tc>
-          <w:tcPr/>
-          <w:p>
-            <w:pPr>
-              <w:pStyle w:val="Compact"/>
-            </w:pPr>
-            <w:r>
-              <w:t xml:space="preserve">2</w:t>
-            </w:r>
-          </w:p>
-        </w:tc>
-        <w:tc>
-          <w:tcPr/>
-          <w:p>
-            <w:pPr>
-              <w:pStyle w:val="Compact"/>
-            </w:pPr>
-            <w:r>
-              <w:t xml:space="preserve">Does</w:t>
-            </w:r>
-            <w:r>
-              <w:t xml:space="preserve"> </w:t>
-            </w:r>
-            <w:r>
-              <w:rPr>
-                <w:rStyle w:val="VerbatimChar"/>
-              </w:rPr>
-              <w:t xml:space="preserve">cld sync</w:t>
-            </w:r>
-            <w:r>
-              <w:t xml:space="preserve"> </w:t>
-            </w:r>
-            <w:r>
-              <w:t xml:space="preserve">support cloud-to-cloud (environment-to-environment) operation, or is it limited to local-folder ↔ cloud?</w:t>
+              <w:t xml:space="preserve">Determines whether a monitoring wrapper is needed</w:t>
+            </w:r>
+          </w:p>
+        </w:tc>
+      </w:tr>
+      <w:tr>
+        <w:tc>
+          <w:tcPr/>
+          <w:p>
+            <w:pPr>
+              <w:pStyle w:val="Compact"/>
+            </w:pPr>
+            <w:r>
+              <w:t xml:space="preserve">5</w:t>
+            </w:r>
+          </w:p>
+        </w:tc>
+        <w:tc>
+          <w:tcPr/>
+          <w:p>
+            <w:pPr>
+              <w:pStyle w:val="Compact"/>
+            </w:pPr>
+            <w:r>
+              <w:t xml:space="preserve">How should delivery requests for assets not yet cloned be handled during a rolling transfer? (Fallback to old env? 404?)</w:t>
             </w:r>
           </w:p>
         </w:tc>
@@ -2323,31 +3009,77 @@
               <w:pStyle w:val="Compact"/>
             </w:pPr>
             <w:r>
-              <w:t xml:space="preserve">If local-only, Option A is eliminated</w:t>
-            </w:r>
-          </w:p>
-        </w:tc>
-      </w:tr>
-      <w:tr>
-        <w:tc>
-          <w:tcPr/>
-          <w:p>
-            <w:pPr>
-              <w:pStyle w:val="Compact"/>
-            </w:pPr>
-            <w:r>
-              <w:t xml:space="preserve">3</w:t>
-            </w:r>
-          </w:p>
-        </w:tc>
-        <w:tc>
-          <w:tcPr/>
-          <w:p>
-            <w:pPr>
-              <w:pStyle w:val="Compact"/>
-            </w:pPr>
-            <w:r>
-              <w:t xml:space="preserve">Does either CLI command consume Admin API quota internally, and what is the request rate behavior at scale?</w:t>
+              <w:t xml:space="preserve">Cutover sequencing risk</w:t>
+            </w:r>
+          </w:p>
+        </w:tc>
+      </w:tr>
+      <w:tr>
+        <w:tc>
+          <w:tcPr/>
+          <w:p>
+            <w:pPr>
+              <w:pStyle w:val="Compact"/>
+            </w:pPr>
+            <w:r>
+              <w:t xml:space="preserve">6</w:t>
+            </w:r>
+          </w:p>
+        </w:tc>
+        <w:tc>
+          <w:tcPr/>
+          <w:p>
+            <w:pPr>
+              <w:pStyle w:val="Compact"/>
+            </w:pPr>
+            <w:r>
+              <w:t xml:space="preserve">Can the Admin API rate limit be temporarily raised to 20,000+ req/hr to support enumeration in Option B if needed?</w:t>
+            </w:r>
+          </w:p>
+        </w:tc>
+        <w:tc>
+          <w:tcPr/>
+          <w:p>
+            <w:pPr>
+              <w:pStyle w:val="Compact"/>
+            </w:pPr>
+            <w:r>
+              <w:t xml:space="preserve">B</w:t>
+            </w:r>
+          </w:p>
+        </w:tc>
+        <w:tc>
+          <w:tcPr/>
+          <w:p>
+            <w:pPr>
+              <w:pStyle w:val="Compact"/>
+            </w:pPr>
+            <w:r>
+              <w:t xml:space="preserve">Determines max throughput and migration duration</w:t>
+            </w:r>
+          </w:p>
+        </w:tc>
+      </w:tr>
+      <w:tr>
+        <w:tc>
+          <w:tcPr/>
+          <w:p>
+            <w:pPr>
+              <w:pStyle w:val="Compact"/>
+            </w:pPr>
+            <w:r>
+              <w:t xml:space="preserve">7</w:t>
+            </w:r>
+          </w:p>
+        </w:tc>
+        <w:tc>
+          <w:tcPr/>
+          <w:p>
+            <w:pPr>
+              <w:pStyle w:val="Compact"/>
+            </w:pPr>
+            <w:r>
+              <w:t xml:space="preserve">We need clarity on how the Structured Metadata will be moved to the New Environments. This is a step performed by PS and must be considered in the migration plan</w:t>
             </w:r>
           </w:p>
         </w:tc>
@@ -2369,138 +3101,31 @@
               <w:pStyle w:val="Compact"/>
             </w:pPr>
             <w:r>
-              <w:t xml:space="preserve">Risk of exhausting 5,000 req/hr during migration</w:t>
-            </w:r>
-          </w:p>
-        </w:tc>
-      </w:tr>
-      <w:tr>
-        <w:tc>
-          <w:tcPr/>
-          <w:p>
-            <w:pPr>
-              <w:pStyle w:val="Compact"/>
-            </w:pPr>
-            <w:r>
-              <w:t xml:space="preserve">4</w:t>
-            </w:r>
-          </w:p>
-        </w:tc>
-        <w:tc>
-          <w:tcPr/>
-          <w:p>
-            <w:pPr>
-              <w:pStyle w:val="Compact"/>
-            </w:pPr>
-            <w:r>
-              <w:t xml:space="preserve">Will CLI commands operate correctly against a target environment that already has BYOB (S3) configured as the storage backend?</w:t>
-            </w:r>
-          </w:p>
-        </w:tc>
-        <w:tc>
-          <w:tcPr/>
-          <w:p>
-            <w:pPr>
-              <w:pStyle w:val="Compact"/>
-            </w:pPr>
-            <w:r>
-              <w:t xml:space="preserve">A</w:t>
-            </w:r>
-          </w:p>
-        </w:tc>
-        <w:tc>
-          <w:tcPr/>
-          <w:p>
-            <w:pPr>
-              <w:pStyle w:val="Compact"/>
-            </w:pPr>
-            <w:r>
-              <w:t xml:space="preserve">CLI + BYOB combination may not be validated by PS</w:t>
-            </w:r>
-          </w:p>
-        </w:tc>
-      </w:tr>
-      <w:tr>
-        <w:tc>
-          <w:tcPr/>
-          <w:p>
-            <w:pPr>
-              <w:pStyle w:val="Compact"/>
-            </w:pPr>
-            <w:r>
-              <w:t xml:space="preserve">5</w:t>
-            </w:r>
-          </w:p>
-        </w:tc>
-        <w:tc>
-          <w:tcPr/>
-          <w:p>
-            <w:pPr>
-              <w:pStyle w:val="Compact"/>
-            </w:pPr>
-            <w:r>
-              <w:t xml:space="preserve">Can Cloudinary configure a cross-account S3 permission (replication rule or</w:t>
-            </w:r>
-            <w:r>
-              <w:t xml:space="preserve"> </w:t>
-            </w:r>
-            <w:r>
-              <w:rPr>
-                <w:rStyle w:val="VerbatimChar"/>
-              </w:rPr>
-              <w:t xml:space="preserve">CopyObject</w:t>
-            </w:r>
-            <w:r>
-              <w:t xml:space="preserve"> </w:t>
-            </w:r>
-            <w:r>
-              <w:t xml:space="preserve">IAM grant) from Cloudinary’s internal bucket to UTA’s S3 bucket?</w:t>
-            </w:r>
-          </w:p>
-        </w:tc>
-        <w:tc>
-          <w:tcPr/>
-          <w:p>
-            <w:pPr>
-              <w:pStyle w:val="Compact"/>
-            </w:pPr>
-            <w:r>
-              <w:t xml:space="preserve">C</w:t>
-            </w:r>
-          </w:p>
-        </w:tc>
-        <w:tc>
-          <w:tcPr/>
-          <w:p>
-            <w:pPr>
-              <w:pStyle w:val="Compact"/>
-            </w:pPr>
-            <w:r>
-              <w:t xml:space="preserve">Determines whether Option C is viable at all</w:t>
-            </w:r>
-          </w:p>
-        </w:tc>
-      </w:tr>
-      <w:tr>
-        <w:tc>
-          <w:tcPr/>
-          <w:p>
-            <w:pPr>
-              <w:pStyle w:val="Compact"/>
-            </w:pPr>
-            <w:r>
-              <w:t xml:space="preserve">6</w:t>
-            </w:r>
-          </w:p>
-        </w:tc>
-        <w:tc>
-          <w:tcPr/>
-          <w:p>
-            <w:pPr>
-              <w:pStyle w:val="Compact"/>
-            </w:pPr>
-            <w:r>
-              <w:t xml:space="preserve">What is the PS engagement scope, estimated hours, and timeline for BYOB configuration + new environment setup?</w:t>
+              <w:t xml:space="preserve">This will affect the cutover plan</w:t>
+            </w:r>
+          </w:p>
+        </w:tc>
+      </w:tr>
+      <w:tr>
+        <w:tc>
+          <w:tcPr/>
+          <w:p>
+            <w:pPr>
+              <w:pStyle w:val="Compact"/>
+            </w:pPr>
+            <w:r>
+              <w:t xml:space="preserve">8</w:t>
+            </w:r>
+          </w:p>
+        </w:tc>
+        <w:tc>
+          <w:tcPr/>
+          <w:p>
+            <w:pPr>
+              <w:pStyle w:val="Compact"/>
+            </w:pPr>
+            <w:r>
+              <w:t xml:space="preserve">What is PS engagement scope, estimated hours, and timeline for BYOB configuration + environment setup?</w:t>
             </w:r>
           </w:p>
         </w:tc>
@@ -2523,110 +3148,6 @@
             </w:pPr>
             <w:r>
               <w:t xml:space="preserve">Required for project planning and budgeting</w:t>
-            </w:r>
-          </w:p>
-        </w:tc>
-      </w:tr>
-      <w:tr>
-        <w:tc>
-          <w:tcPr/>
-          <w:p>
-            <w:pPr>
-              <w:pStyle w:val="Compact"/>
-            </w:pPr>
-            <w:r>
-              <w:t xml:space="preserve">7</w:t>
-            </w:r>
-          </w:p>
-        </w:tc>
-        <w:tc>
-          <w:tcPr/>
-          <w:p>
-            <w:pPr>
-              <w:pStyle w:val="Compact"/>
-            </w:pPr>
-            <w:r>
-              <w:t xml:space="preserve">Is there a supported way to do a bulk metadata export (all</w:t>
-            </w:r>
-            <w:r>
-              <w:t xml:space="preserve"> </w:t>
-            </w:r>
-            <w:r>
-              <w:rPr>
-                <w:rStyle w:val="VerbatimChar"/>
-              </w:rPr>
-              <w:t xml:space="preserve">public_id</w:t>
-            </w:r>
-            <w:r>
-              <w:t xml:space="preserve">s, tags, context fields, resource types) from the current environment to use as input to a migration script?</w:t>
-            </w:r>
-          </w:p>
-        </w:tc>
-        <w:tc>
-          <w:tcPr/>
-          <w:p>
-            <w:pPr>
-              <w:pStyle w:val="Compact"/>
-            </w:pPr>
-            <w:r>
-              <w:t xml:space="preserve">B</w:t>
-            </w:r>
-          </w:p>
-        </w:tc>
-        <w:tc>
-          <w:tcPr/>
-          <w:p>
-            <w:pPr>
-              <w:pStyle w:val="Compact"/>
-            </w:pPr>
-            <w:r>
-              <w:t xml:space="preserve">Accelerates Option B controller implementation</w:t>
-            </w:r>
-          </w:p>
-        </w:tc>
-      </w:tr>
-      <w:tr>
-        <w:tc>
-          <w:tcPr/>
-          <w:p>
-            <w:pPr>
-              <w:pStyle w:val="Compact"/>
-            </w:pPr>
-            <w:r>
-              <w:t xml:space="preserve">8</w:t>
-            </w:r>
-          </w:p>
-        </w:tc>
-        <w:tc>
-          <w:tcPr/>
-          <w:p>
-            <w:pPr>
-              <w:pStyle w:val="Compact"/>
-            </w:pPr>
-            <w:r>
-              <w:t xml:space="preserve">Can the Admin API rate limit be temporarily raised to 20,000+ req/hr for the migration window, and what is the process to request it?</w:t>
-            </w:r>
-          </w:p>
-        </w:tc>
-        <w:tc>
-          <w:tcPr/>
-          <w:p>
-            <w:pPr>
-              <w:pStyle w:val="Compact"/>
-            </w:pPr>
-            <w:r>
-              <w:t xml:space="preserve">B</w:t>
-            </w:r>
-          </w:p>
-        </w:tc>
-        <w:tc>
-          <w:tcPr/>
-          <w:p>
-            <w:pPr>
-              <w:pStyle w:val="Compact"/>
-            </w:pPr>
-            <w:r>
-              <w:t xml:space="preserve">Determines max throughput and migration duration</w:t>
             </w:r>
           </w:p>
         </w:tc>
@@ -2654,11 +3175,11 @@
         <w:pStyle w:val="Compact"/>
         <w:numPr>
           <w:ilvl w:val="0"/>
-          <w:numId w:val="1004"/>
+          <w:numId w:val="1001"/>
         </w:numPr>
       </w:pPr>
       <w:r>
-        <w:t xml:space="preserve">A new Cloudinary environment is mandatory before any migration activity.</w:t>
+        <w:t xml:space="preserve">A new Cloudinary environment is mandatory before any migration activity (confirmed Q&amp;A 3).</w:t>
       </w:r>
     </w:p>
     <w:p>
@@ -2666,7 +3187,19 @@
         <w:pStyle w:val="Compact"/>
         <w:numPr>
           <w:ilvl w:val="0"/>
-          <w:numId w:val="1004"/>
+          <w:numId w:val="1001"/>
+        </w:numPr>
+      </w:pPr>
+      <w:r>
+        <w:t xml:space="preserve">PS configures BYOB backend before any clone or upload operation runs (confirmed Q&amp;A 3).</w:t>
+      </w:r>
+    </w:p>
+    <w:p>
+      <w:pPr>
+        <w:pStyle w:val="Compact"/>
+        <w:numPr>
+          <w:ilvl w:val="0"/>
+          <w:numId w:val="1001"/>
         </w:numPr>
       </w:pPr>
       <w:r>
@@ -2679,7 +3212,7 @@
         <w:t xml:space="preserve"> </w:t>
       </w:r>
       <w:r>
-        <w:t xml:space="preserve">values will be preserved exactly in the new environment (confirmed in Q&amp;A 2).</w:t>
+        <w:t xml:space="preserve">values will be preserved exactly in the new environment (confirmed Q&amp;A 2).</w:t>
       </w:r>
     </w:p>
     <w:p>
@@ -2687,11 +3220,11 @@
         <w:pStyle w:val="Compact"/>
         <w:numPr>
           <w:ilvl w:val="0"/>
-          <w:numId w:val="1004"/>
+          <w:numId w:val="1001"/>
         </w:numPr>
       </w:pPr>
       <w:r>
-        <w:t xml:space="preserve">CNAME cutover approach is viable for URL continuity (confirmed in Q&amp;A 2).</w:t>
+        <w:t xml:space="preserve">CNAME cutover approach is viable for URL continuity (confirmed Q&amp;A 2).</w:t>
       </w:r>
     </w:p>
     <w:p>
@@ -2699,11 +3232,20 @@
         <w:pStyle w:val="Compact"/>
         <w:numPr>
           <w:ilvl w:val="0"/>
-          <w:numId w:val="1004"/>
+          <w:numId w:val="1001"/>
         </w:numPr>
       </w:pPr>
       <w:r>
-        <w:t xml:space="preserve">PS handles BYOB backend configuration; UTA/delivery team handles data transfer and application validation.</w:t>
+        <w:rPr>
+          <w:rStyle w:val="VerbatimChar"/>
+        </w:rPr>
+        <w:t xml:space="preserve">cld sync</w:t>
+      </w:r>
+      <w:r>
+        <w:t xml:space="preserve"> </w:t>
+      </w:r>
+      <w:r>
+        <w:t xml:space="preserve">is eliminated — local filesystem only, not usable for environment-to-environment transfer (confirmed Q&amp;A 3).</w:t>
       </w:r>
     </w:p>
     <w:p>
@@ -2711,11 +3253,11 @@
         <w:pStyle w:val="Compact"/>
         <w:numPr>
           <w:ilvl w:val="0"/>
-          <w:numId w:val="1004"/>
+          <w:numId w:val="1001"/>
         </w:numPr>
       </w:pPr>
       <w:r>
-        <w:t xml:space="preserve">Cloudinary backup storage cannot be used as a migration source (confirmed in Q&amp;A 2).</w:t>
+        <w:t xml:space="preserve">Old Cloudinary environment is retained post-migration as rollback safeguard (confirmed Q&amp;A 2).</w:t>
       </w:r>
     </w:p>
     <w:p>
@@ -2723,11 +3265,11 @@
         <w:pStyle w:val="Compact"/>
         <w:numPr>
           <w:ilvl w:val="0"/>
-          <w:numId w:val="1004"/>
+          <w:numId w:val="1001"/>
         </w:numPr>
       </w:pPr>
       <w:r>
-        <w:t xml:space="preserve">Migration runs are scheduled outside West Coast peak hours (9 AM – 5 PM PT).</w:t>
+        <w:t xml:space="preserve">Structured metadata taxonomy requires a separate export/re-import process regardless of option chosen (confirmed Q&amp;A 3).</w:t>
       </w:r>
     </w:p>
     <w:p>
@@ -2735,11 +3277,35 @@
         <w:pStyle w:val="Compact"/>
         <w:numPr>
           <w:ilvl w:val="0"/>
-          <w:numId w:val="1004"/>
+          <w:numId w:val="1001"/>
         </w:numPr>
       </w:pPr>
       <w:r>
+        <w:t xml:space="preserve">Upload presets and environment configuration must be independently reconfigured on the new environment (confirmed Q&amp;A 3).</w:t>
+      </w:r>
+    </w:p>
+    <w:p>
+      <w:pPr>
+        <w:pStyle w:val="Compact"/>
+        <w:numPr>
+          <w:ilvl w:val="0"/>
+          <w:numId w:val="1001"/>
+        </w:numPr>
+      </w:pPr>
+      <w:r>
         <w:t xml:space="preserve">Encryption at rest (SSE-KMS) is mandatory on the UTA S3 bucket; KMS key policy must permit Cloudinary’s IAM principal.</w:t>
+      </w:r>
+    </w:p>
+    <w:p>
+      <w:pPr>
+        <w:pStyle w:val="Compact"/>
+        <w:numPr>
+          <w:ilvl w:val="0"/>
+          <w:numId w:val="1001"/>
+        </w:numPr>
+      </w:pPr>
+      <w:r>
+        <w:t xml:space="preserve">Migration runs are scheduled outside West Coast peak hours (9 AM – 5 PM PT).</w:t>
       </w:r>
     </w:p>
     <w:p>
@@ -2750,7 +3316,7 @@
       </w:r>
     </w:p>
     <w:bookmarkEnd w:id="21"/>
-    <w:bookmarkStart w:id="26" w:name="related-documents"/>
+    <w:bookmarkStart w:id="28" w:name="related-documents"/>
     <w:p>
       <w:pPr>
         <w:pStyle w:val="Heading2"/>
@@ -2764,10 +3330,27 @@
         <w:pStyle w:val="Compact"/>
         <w:numPr>
           <w:ilvl w:val="0"/>
-          <w:numId w:val="1005"/>
+          <w:numId w:val="1002"/>
         </w:numPr>
       </w:pPr>
       <w:hyperlink r:id="rId22">
+        <w:r>
+          <w:rPr>
+            <w:rStyle w:val="Hyperlink"/>
+          </w:rPr>
+          <w:t xml:space="preserve">v1: Migration Path Options Analysis</w:t>
+        </w:r>
+      </w:hyperlink>
+    </w:p>
+    <w:p>
+      <w:pPr>
+        <w:pStyle w:val="Compact"/>
+        <w:numPr>
+          <w:ilvl w:val="0"/>
+          <w:numId w:val="1002"/>
+        </w:numPr>
+      </w:pPr>
+      <w:hyperlink r:id="rId23">
         <w:r>
           <w:rPr>
             <w:rStyle w:val="Hyperlink"/>
@@ -2781,10 +3364,10 @@
         <w:pStyle w:val="Compact"/>
         <w:numPr>
           <w:ilvl w:val="0"/>
-          <w:numId w:val="1005"/>
+          <w:numId w:val="1002"/>
         </w:numPr>
       </w:pPr>
-      <w:hyperlink r:id="rId23">
+      <w:hyperlink r:id="rId24">
         <w:r>
           <w:rPr>
             <w:rStyle w:val="Hyperlink"/>
@@ -2798,10 +3381,10 @@
         <w:pStyle w:val="Compact"/>
         <w:numPr>
           <w:ilvl w:val="0"/>
-          <w:numId w:val="1005"/>
+          <w:numId w:val="1002"/>
         </w:numPr>
       </w:pPr>
-      <w:hyperlink r:id="rId24">
+      <w:hyperlink r:id="rId25">
         <w:r>
           <w:rPr>
             <w:rStyle w:val="Hyperlink"/>
@@ -2815,10 +3398,27 @@
         <w:pStyle w:val="Compact"/>
         <w:numPr>
           <w:ilvl w:val="0"/>
-          <w:numId w:val="1005"/>
+          <w:numId w:val="1002"/>
         </w:numPr>
       </w:pPr>
-      <w:hyperlink r:id="rId25">
+      <w:hyperlink r:id="rId26">
+        <w:r>
+          <w:rPr>
+            <w:rStyle w:val="Hyperlink"/>
+          </w:rPr>
+          <w:t xml:space="preserve">Cloudinary Q&amp;A 3</w:t>
+        </w:r>
+      </w:hyperlink>
+    </w:p>
+    <w:p>
+      <w:pPr>
+        <w:pStyle w:val="Compact"/>
+        <w:numPr>
+          <w:ilvl w:val="0"/>
+          <w:numId w:val="1002"/>
+        </w:numPr>
+      </w:pPr>
+      <w:hyperlink r:id="rId27">
         <w:r>
           <w:rPr>
             <w:rStyle w:val="Hyperlink"/>
@@ -2827,8 +3427,8 @@
         </w:r>
       </w:hyperlink>
     </w:p>
-    <w:bookmarkEnd w:id="26"/>
-    <w:bookmarkEnd w:id="27"/>
+    <w:bookmarkEnd w:id="28"/>
+    <w:bookmarkEnd w:id="29"/>
     <w:sectPr>
       <w:footnotePr>
         <w:numRestart w:val="eachSect"/>
@@ -3049,15 +3649,6 @@
     <w:abstractNumId w:val="991"/>
   </w:num>
   <w:num w:numId="1002">
-    <w:abstractNumId w:val="991"/>
-  </w:num>
-  <w:num w:numId="1003">
-    <w:abstractNumId w:val="991"/>
-  </w:num>
-  <w:num w:numId="1004">
-    <w:abstractNumId w:val="991"/>
-  </w:num>
-  <w:num w:numId="1005">
     <w:abstractNumId w:val="991"/>
   </w:num>
 </w:numbering>

</xml_diff>